<commit_message>
Persist editor draft & add drag-and-drop upload
Save editor draft to sessionStorage on beforeunload using editorInstance to avoid losing content that bypasses editorContent. Add drag-and-drop support to TranscriberSection: introduce isDragging state, visual dashed-border feedback, and handlers for dragOver/leave/drop. Extract file validation into processFile (type and 100MB size checks), refactor file input handling to use it, and update UI copy. Also includes an updated DOCX in docs/.
</commit_message>
<xml_diff>
--- a/docs/Отчёт_MindeSync.docx
+++ b/docs/Отчёт_MindeSync.docx
@@ -50,49 +50,61 @@
     <w:p>
       <w:pPr>
         <w:ind w:firstLine="0"/>
-        <w:rPr>
-          <w:lang w:val="ru-RU"/>
-        </w:rPr>
-      </w:pPr>
+        <w:jc w:val="center"/>
+        <w:rPr>
+          <w:lang w:val="ru-RU"/>
+        </w:rPr>
+      </w:pPr>
+      <w:r>
+        <w:rPr>
+          <w:b/>
+          <w:lang w:val="ru-RU"/>
+        </w:rPr>
+        <w:t>МОСКОВСКИЙ ТЕХНИЧЕСКИЙ УНИВЕРСИТЕТ СВЯЗИ И ИНФОРМАТИКИ</w:t>
+      </w:r>
     </w:p>
     <w:p>
       <w:pPr>
         <w:ind w:firstLine="0"/>
-        <w:jc w:val="center"/>
-        <w:rPr>
-          <w:lang w:val="ru-RU"/>
-        </w:rPr>
-      </w:pPr>
-      <w:r>
-        <w:rPr>
-          <w:b/>
-          <w:lang w:val="ru-RU"/>
-        </w:rPr>
-        <w:t>МОСКОВСКИЙ ТЕХНИЧЕСКИЙ УНИВЕРСИТЕТ СВЯЗИ И ИНФОРМАТИКИ</w:t>
-      </w:r>
+        <w:rPr>
+          <w:lang w:val="ru-RU"/>
+        </w:rPr>
+      </w:pPr>
     </w:p>
     <w:p>
       <w:pPr>
         <w:ind w:firstLine="0"/>
-        <w:rPr>
-          <w:lang w:val="ru-RU"/>
-        </w:rPr>
-      </w:pPr>
+        <w:jc w:val="center"/>
+        <w:rPr>
+          <w:lang w:val="ru-RU"/>
+        </w:rPr>
+      </w:pPr>
+      <w:r>
+        <w:rPr>
+          <w:lang w:val="ru-RU"/>
+        </w:rPr>
+        <w:t>Кафедра «</w:t>
+      </w:r>
+      <w:r>
+        <w:rPr>
+          <w:lang w:val="ru-RU"/>
+        </w:rPr>
+        <w:t>Математическая кибернетика и информационные технологии</w:t>
+      </w:r>
+      <w:r>
+        <w:rPr>
+          <w:lang w:val="ru-RU"/>
+        </w:rPr>
+        <w:t>»</w:t>
+      </w:r>
     </w:p>
     <w:p>
       <w:pPr>
         <w:ind w:firstLine="0"/>
-        <w:jc w:val="center"/>
-        <w:rPr>
-          <w:lang w:val="ru-RU"/>
-        </w:rPr>
-      </w:pPr>
-      <w:r>
-        <w:rPr>
-          <w:lang w:val="ru-RU"/>
-        </w:rPr>
-        <w:t>Кафедра «________________________»</w:t>
-      </w:r>
+        <w:rPr>
+          <w:lang w:val="ru-RU"/>
+        </w:rPr>
+      </w:pPr>
     </w:p>
     <w:p>
       <w:pPr>
@@ -121,18 +133,44 @@
     <w:p>
       <w:pPr>
         <w:ind w:firstLine="0"/>
-        <w:rPr>
-          <w:lang w:val="ru-RU"/>
-        </w:rPr>
-      </w:pPr>
+        <w:jc w:val="center"/>
+        <w:rPr>
+          <w:lang w:val="ru-RU"/>
+        </w:rPr>
+      </w:pPr>
+      <w:r>
+        <w:rPr>
+          <w:lang w:val="ru-RU"/>
+        </w:rPr>
+        <w:t>Отчёт по проекту</w:t>
+      </w:r>
     </w:p>
     <w:p>
       <w:pPr>
         <w:ind w:firstLine="0"/>
-        <w:rPr>
-          <w:lang w:val="ru-RU"/>
-        </w:rPr>
-      </w:pPr>
+        <w:jc w:val="center"/>
+        <w:rPr>
+          <w:lang w:val="ru-RU"/>
+        </w:rPr>
+      </w:pPr>
+      <w:r>
+        <w:rPr>
+          <w:lang w:val="ru-RU"/>
+        </w:rPr>
+        <w:t>по дисциплине «</w:t>
+      </w:r>
+      <w:r>
+        <w:rPr>
+          <w:lang w:val="ru-RU"/>
+        </w:rPr>
+        <w:t>Проектный практикум</w:t>
+      </w:r>
+      <w:r>
+        <w:rPr>
+          <w:lang w:val="ru-RU"/>
+        </w:rPr>
+        <w:t>»</w:t>
+      </w:r>
     </w:p>
     <w:p>
       <w:pPr>
@@ -146,7 +184,7 @@
         <w:rPr>
           <w:lang w:val="ru-RU"/>
         </w:rPr>
-        <w:t>Отчёт по проекту</w:t>
+        <w:t>по теме: «Веб-платформа обработки студенческих лекций</w:t>
       </w:r>
     </w:p>
     <w:p>
@@ -157,45 +195,33 @@
           <w:lang w:val="ru-RU"/>
         </w:rPr>
       </w:pPr>
-      <w:r>
-        <w:rPr>
-          <w:lang w:val="ru-RU"/>
-        </w:rPr>
-        <w:t>по дисциплине «________________________»</w:t>
+      <w:proofErr w:type="spellStart"/>
+      <w:r>
+        <w:t>MindeSync</w:t>
+      </w:r>
+      <w:proofErr w:type="spellEnd"/>
+      <w:r>
+        <w:rPr>
+          <w:lang w:val="ru-RU"/>
+        </w:rPr>
+        <w:t>»</w:t>
       </w:r>
     </w:p>
     <w:p>
       <w:pPr>
         <w:ind w:firstLine="0"/>
-        <w:jc w:val="center"/>
-        <w:rPr>
-          <w:lang w:val="ru-RU"/>
-        </w:rPr>
-      </w:pPr>
-      <w:r>
-        <w:rPr>
-          <w:lang w:val="ru-RU"/>
-        </w:rPr>
-        <w:t>«Веб-платформа обработки студенческих лекций</w:t>
-      </w:r>
+        <w:rPr>
+          <w:lang w:val="ru-RU"/>
+        </w:rPr>
+      </w:pPr>
     </w:p>
     <w:p>
       <w:pPr>
         <w:ind w:firstLine="0"/>
-        <w:jc w:val="center"/>
-        <w:rPr>
-          <w:lang w:val="ru-RU"/>
-        </w:rPr>
-      </w:pPr>
-      <w:r>
-        <w:t>MindeSync</w:t>
-      </w:r>
-      <w:r>
-        <w:rPr>
-          <w:lang w:val="ru-RU"/>
-        </w:rPr>
-        <w:t>»</w:t>
-      </w:r>
+        <w:rPr>
+          <w:lang w:val="ru-RU"/>
+        </w:rPr>
+      </w:pPr>
     </w:p>
     <w:p>
       <w:pPr>
@@ -217,8 +243,14 @@
       <w:pPr>
         <w:ind w:firstLine="0"/>
         <w:jc w:val="right"/>
-      </w:pPr>
-      <w:r>
+        <w:rPr>
+          <w:lang w:val="ru-RU"/>
+        </w:rPr>
+      </w:pPr>
+      <w:r>
+        <w:rPr>
+          <w:lang w:val="ru-RU"/>
+        </w:rPr>
         <w:t>Выполнил студент группы:</w:t>
       </w:r>
     </w:p>
@@ -230,11 +262,19 @@
           <w:lang w:val="ru-RU"/>
         </w:rPr>
       </w:pPr>
-      <w:r>
-        <w:rPr>
-          <w:lang w:val="ru-RU"/>
-        </w:rPr>
-        <w:t>________________</w:t>
+      <w:proofErr w:type="spellStart"/>
+      <w:r>
+        <w:rPr>
+          <w:lang w:val="ru-RU"/>
+        </w:rPr>
+        <w:t>Сесицкий</w:t>
+      </w:r>
+      <w:proofErr w:type="spellEnd"/>
+      <w:r>
+        <w:rPr>
+          <w:lang w:val="ru-RU"/>
+        </w:rPr>
+        <w:t xml:space="preserve"> Иван, студент группы БВТ2403</w:t>
       </w:r>
     </w:p>
     <w:p>
@@ -249,16 +289,23 @@
         <w:rPr>
           <w:lang w:val="ru-RU"/>
         </w:rPr>
-        <w:t>________________ (Ф. И. О.)</w:t>
+        <w:t>Подъельников Михаил, студент группы БВТ2403</w:t>
       </w:r>
     </w:p>
     <w:p>
       <w:pPr>
         <w:ind w:firstLine="0"/>
-        <w:rPr>
-          <w:lang w:val="ru-RU"/>
-        </w:rPr>
-      </w:pPr>
+        <w:jc w:val="right"/>
+        <w:rPr>
+          <w:lang w:val="ru-RU"/>
+        </w:rPr>
+      </w:pPr>
+      <w:r>
+        <w:rPr>
+          <w:lang w:val="ru-RU"/>
+        </w:rPr>
+        <w:t>Титов Дмитрий, студент группы БВТ2403</w:t>
+      </w:r>
     </w:p>
     <w:p>
       <w:pPr>
@@ -410,7 +457,7 @@
       <w:r>
         <w:fldChar w:fldCharType="separate"/>
       </w:r>
-      <w:hyperlink w:anchor="_Toc231647857" w:history="1">
+      <w:hyperlink w:anchor="_Toc231727504" w:history="1">
         <w:r>
           <w:rPr>
             <w:rStyle w:val="aff8"/>
@@ -438,7 +485,7 @@
             <w:noProof/>
             <w:webHidden/>
           </w:rPr>
-          <w:instrText xml:space="preserve"> PAGEREF _Toc231647857 \h </w:instrText>
+          <w:instrText xml:space="preserve"> PAGEREF _Toc231727504 \h </w:instrText>
         </w:r>
         <w:r>
           <w:rPr>
@@ -479,7 +526,7 @@
           <w:noProof/>
         </w:rPr>
       </w:pPr>
-      <w:hyperlink w:anchor="_Toc231647858" w:history="1">
+      <w:hyperlink w:anchor="_Toc231727505" w:history="1">
         <w:r>
           <w:rPr>
             <w:rStyle w:val="aff8"/>
@@ -507,7 +554,7 @@
             <w:noProof/>
             <w:webHidden/>
           </w:rPr>
-          <w:instrText xml:space="preserve"> PAGEREF _Toc231647858 \h </w:instrText>
+          <w:instrText xml:space="preserve"> PAGEREF _Toc231727505 \h </w:instrText>
         </w:r>
         <w:r>
           <w:rPr>
@@ -548,7 +595,7 @@
           <w:noProof/>
         </w:rPr>
       </w:pPr>
-      <w:hyperlink w:anchor="_Toc231647859" w:history="1">
+      <w:hyperlink w:anchor="_Toc231727506" w:history="1">
         <w:r>
           <w:rPr>
             <w:rStyle w:val="aff8"/>
@@ -575,7 +622,7 @@
             <w:noProof/>
             <w:webHidden/>
           </w:rPr>
-          <w:instrText xml:space="preserve"> PAGEREF _Toc231647859 \h </w:instrText>
+          <w:instrText xml:space="preserve"> PAGEREF _Toc231727506 \h </w:instrText>
         </w:r>
         <w:r>
           <w:rPr>
@@ -616,7 +663,7 @@
           <w:noProof/>
         </w:rPr>
       </w:pPr>
-      <w:hyperlink w:anchor="_Toc231647860" w:history="1">
+      <w:hyperlink w:anchor="_Toc231727507" w:history="1">
         <w:r>
           <w:rPr>
             <w:rStyle w:val="aff8"/>
@@ -644,7 +691,7 @@
             <w:noProof/>
             <w:webHidden/>
           </w:rPr>
-          <w:instrText xml:space="preserve"> PAGEREF _Toc231647860 \h </w:instrText>
+          <w:instrText xml:space="preserve"> PAGEREF _Toc231727507 \h </w:instrText>
         </w:r>
         <w:r>
           <w:rPr>
@@ -685,7 +732,7 @@
           <w:noProof/>
         </w:rPr>
       </w:pPr>
-      <w:hyperlink w:anchor="_Toc231647861" w:history="1">
+      <w:hyperlink w:anchor="_Toc231727508" w:history="1">
         <w:r>
           <w:rPr>
             <w:rStyle w:val="aff8"/>
@@ -713,7 +760,7 @@
             <w:noProof/>
             <w:webHidden/>
           </w:rPr>
-          <w:instrText xml:space="preserve"> PAGEREF _Toc231647861 \h </w:instrText>
+          <w:instrText xml:space="preserve"> PAGEREF _Toc231727508 \h </w:instrText>
         </w:r>
         <w:r>
           <w:rPr>
@@ -754,7 +801,7 @@
           <w:noProof/>
         </w:rPr>
       </w:pPr>
-      <w:hyperlink w:anchor="_Toc231647862" w:history="1">
+      <w:hyperlink w:anchor="_Toc231727509" w:history="1">
         <w:r>
           <w:rPr>
             <w:rStyle w:val="aff8"/>
@@ -782,7 +829,7 @@
             <w:noProof/>
             <w:webHidden/>
           </w:rPr>
-          <w:instrText xml:space="preserve"> PAGEREF _Toc231647862 \h </w:instrText>
+          <w:instrText xml:space="preserve"> PAGEREF _Toc231727509 \h </w:instrText>
         </w:r>
         <w:r>
           <w:rPr>
@@ -823,7 +870,7 @@
           <w:noProof/>
         </w:rPr>
       </w:pPr>
-      <w:hyperlink w:anchor="_Toc231647863" w:history="1">
+      <w:hyperlink w:anchor="_Toc231727510" w:history="1">
         <w:r>
           <w:rPr>
             <w:rStyle w:val="aff8"/>
@@ -851,7 +898,7 @@
             <w:noProof/>
             <w:webHidden/>
           </w:rPr>
-          <w:instrText xml:space="preserve"> PAGEREF _Toc231647863 \h </w:instrText>
+          <w:instrText xml:space="preserve"> PAGEREF _Toc231727510 \h </w:instrText>
         </w:r>
         <w:r>
           <w:rPr>
@@ -892,7 +939,7 @@
           <w:noProof/>
         </w:rPr>
       </w:pPr>
-      <w:hyperlink w:anchor="_Toc231647864" w:history="1">
+      <w:hyperlink w:anchor="_Toc231727511" w:history="1">
         <w:r>
           <w:rPr>
             <w:rStyle w:val="aff8"/>
@@ -920,145 +967,7 @@
             <w:noProof/>
             <w:webHidden/>
           </w:rPr>
-          <w:instrText xml:space="preserve"> PAGEREF _Toc231647864 \h </w:instrText>
-        </w:r>
-        <w:r>
-          <w:rPr>
-            <w:noProof/>
-            <w:webHidden/>
-          </w:rPr>
-        </w:r>
-        <w:r>
-          <w:rPr>
-            <w:noProof/>
-            <w:webHidden/>
-          </w:rPr>
-          <w:fldChar w:fldCharType="separate"/>
-        </w:r>
-        <w:r>
-          <w:rPr>
-            <w:noProof/>
-            <w:webHidden/>
-          </w:rPr>
-          <w:t>5</w:t>
-        </w:r>
-        <w:r>
-          <w:rPr>
-            <w:noProof/>
-            <w:webHidden/>
-          </w:rPr>
-          <w:fldChar w:fldCharType="end"/>
-        </w:r>
-      </w:hyperlink>
-    </w:p>
-    <w:p>
-      <w:pPr>
-        <w:pStyle w:val="2c"/>
-        <w:tabs>
-          <w:tab w:val="right" w:leader="dot" w:pos="9345"/>
-        </w:tabs>
-        <w:rPr>
-          <w:noProof/>
-        </w:rPr>
-      </w:pPr>
-      <w:hyperlink w:anchor="_Toc231647865" w:history="1">
-        <w:r>
-          <w:rPr>
-            <w:rStyle w:val="aff8"/>
-            <w:noProof/>
-            <w:lang w:val="ru-RU"/>
-          </w:rPr>
-          <w:t>2.5. Экспорт материалов</w:t>
-        </w:r>
-        <w:r>
-          <w:rPr>
-            <w:noProof/>
-            <w:webHidden/>
-          </w:rPr>
-          <w:tab/>
-        </w:r>
-        <w:r>
-          <w:rPr>
-            <w:noProof/>
-            <w:webHidden/>
-          </w:rPr>
-          <w:fldChar w:fldCharType="begin"/>
-        </w:r>
-        <w:r>
-          <w:rPr>
-            <w:noProof/>
-            <w:webHidden/>
-          </w:rPr>
-          <w:instrText xml:space="preserve"> PAGEREF _Toc231647865 \h </w:instrText>
-        </w:r>
-        <w:r>
-          <w:rPr>
-            <w:noProof/>
-            <w:webHidden/>
-          </w:rPr>
-        </w:r>
-        <w:r>
-          <w:rPr>
-            <w:noProof/>
-            <w:webHidden/>
-          </w:rPr>
-          <w:fldChar w:fldCharType="separate"/>
-        </w:r>
-        <w:r>
-          <w:rPr>
-            <w:noProof/>
-            <w:webHidden/>
-          </w:rPr>
-          <w:t>5</w:t>
-        </w:r>
-        <w:r>
-          <w:rPr>
-            <w:noProof/>
-            <w:webHidden/>
-          </w:rPr>
-          <w:fldChar w:fldCharType="end"/>
-        </w:r>
-      </w:hyperlink>
-    </w:p>
-    <w:p>
-      <w:pPr>
-        <w:pStyle w:val="14"/>
-        <w:tabs>
-          <w:tab w:val="right" w:leader="dot" w:pos="9345"/>
-        </w:tabs>
-        <w:rPr>
-          <w:noProof/>
-        </w:rPr>
-      </w:pPr>
-      <w:hyperlink w:anchor="_Toc231647866" w:history="1">
-        <w:r>
-          <w:rPr>
-            <w:rStyle w:val="aff8"/>
-            <w:noProof/>
-            <w:lang w:val="ru-RU"/>
-          </w:rPr>
-          <w:t>3. Техническая реализация</w:t>
-        </w:r>
-        <w:r>
-          <w:rPr>
-            <w:noProof/>
-            <w:webHidden/>
-          </w:rPr>
-          <w:tab/>
-        </w:r>
-        <w:r>
-          <w:rPr>
-            <w:noProof/>
-            <w:webHidden/>
-          </w:rPr>
-          <w:fldChar w:fldCharType="begin"/>
-        </w:r>
-        <w:r>
-          <w:rPr>
-            <w:noProof/>
-            <w:webHidden/>
-          </w:rPr>
-          <w:instrText xml:space="preserve"> PAGEREF _Toc231647866 \h </w:instrText>
+          <w:instrText xml:space="preserve"> PAGEREF _Toc231727511 \h </w:instrText>
         </w:r>
         <w:r>
           <w:rPr>
@@ -1099,7 +1008,145 @@
           <w:noProof/>
         </w:rPr>
       </w:pPr>
-      <w:hyperlink w:anchor="_Toc231647867" w:history="1">
+      <w:hyperlink w:anchor="_Toc231727512" w:history="1">
+        <w:r>
+          <w:rPr>
+            <w:rStyle w:val="aff8"/>
+            <w:noProof/>
+            <w:lang w:val="ru-RU"/>
+          </w:rPr>
+          <w:t>2.5. Экспорт материалов</w:t>
+        </w:r>
+        <w:r>
+          <w:rPr>
+            <w:noProof/>
+            <w:webHidden/>
+          </w:rPr>
+          <w:tab/>
+        </w:r>
+        <w:r>
+          <w:rPr>
+            <w:noProof/>
+            <w:webHidden/>
+          </w:rPr>
+          <w:fldChar w:fldCharType="begin"/>
+        </w:r>
+        <w:r>
+          <w:rPr>
+            <w:noProof/>
+            <w:webHidden/>
+          </w:rPr>
+          <w:instrText xml:space="preserve"> PAGEREF _Toc231727512 \h </w:instrText>
+        </w:r>
+        <w:r>
+          <w:rPr>
+            <w:noProof/>
+            <w:webHidden/>
+          </w:rPr>
+        </w:r>
+        <w:r>
+          <w:rPr>
+            <w:noProof/>
+            <w:webHidden/>
+          </w:rPr>
+          <w:fldChar w:fldCharType="separate"/>
+        </w:r>
+        <w:r>
+          <w:rPr>
+            <w:noProof/>
+            <w:webHidden/>
+          </w:rPr>
+          <w:t>7</w:t>
+        </w:r>
+        <w:r>
+          <w:rPr>
+            <w:noProof/>
+            <w:webHidden/>
+          </w:rPr>
+          <w:fldChar w:fldCharType="end"/>
+        </w:r>
+      </w:hyperlink>
+    </w:p>
+    <w:p>
+      <w:pPr>
+        <w:pStyle w:val="14"/>
+        <w:tabs>
+          <w:tab w:val="right" w:leader="dot" w:pos="9345"/>
+        </w:tabs>
+        <w:rPr>
+          <w:noProof/>
+        </w:rPr>
+      </w:pPr>
+      <w:hyperlink w:anchor="_Toc231727513" w:history="1">
+        <w:r>
+          <w:rPr>
+            <w:rStyle w:val="aff8"/>
+            <w:noProof/>
+            <w:lang w:val="ru-RU"/>
+          </w:rPr>
+          <w:t>3. Техническая реализация</w:t>
+        </w:r>
+        <w:r>
+          <w:rPr>
+            <w:noProof/>
+            <w:webHidden/>
+          </w:rPr>
+          <w:tab/>
+        </w:r>
+        <w:r>
+          <w:rPr>
+            <w:noProof/>
+            <w:webHidden/>
+          </w:rPr>
+          <w:fldChar w:fldCharType="begin"/>
+        </w:r>
+        <w:r>
+          <w:rPr>
+            <w:noProof/>
+            <w:webHidden/>
+          </w:rPr>
+          <w:instrText xml:space="preserve"> PAGEREF _Toc231727513 \h </w:instrText>
+        </w:r>
+        <w:r>
+          <w:rPr>
+            <w:noProof/>
+            <w:webHidden/>
+          </w:rPr>
+        </w:r>
+        <w:r>
+          <w:rPr>
+            <w:noProof/>
+            <w:webHidden/>
+          </w:rPr>
+          <w:fldChar w:fldCharType="separate"/>
+        </w:r>
+        <w:r>
+          <w:rPr>
+            <w:noProof/>
+            <w:webHidden/>
+          </w:rPr>
+          <w:t>7</w:t>
+        </w:r>
+        <w:r>
+          <w:rPr>
+            <w:noProof/>
+            <w:webHidden/>
+          </w:rPr>
+          <w:fldChar w:fldCharType="end"/>
+        </w:r>
+      </w:hyperlink>
+    </w:p>
+    <w:p>
+      <w:pPr>
+        <w:pStyle w:val="2c"/>
+        <w:tabs>
+          <w:tab w:val="right" w:leader="dot" w:pos="9345"/>
+        </w:tabs>
+        <w:rPr>
+          <w:noProof/>
+        </w:rPr>
+      </w:pPr>
+      <w:hyperlink w:anchor="_Toc231727514" w:history="1">
         <w:r>
           <w:rPr>
             <w:rStyle w:val="aff8"/>
@@ -1127,7 +1174,7 @@
             <w:noProof/>
             <w:webHidden/>
           </w:rPr>
-          <w:instrText xml:space="preserve"> PAGEREF _Toc231647867 \h </w:instrText>
+          <w:instrText xml:space="preserve"> PAGEREF _Toc231727514 \h </w:instrText>
         </w:r>
         <w:r>
           <w:rPr>
@@ -1147,7 +1194,7 @@
             <w:noProof/>
             <w:webHidden/>
           </w:rPr>
-          <w:t>6</w:t>
+          <w:t>7</w:t>
         </w:r>
         <w:r>
           <w:rPr>
@@ -1168,7 +1215,7 @@
           <w:noProof/>
         </w:rPr>
       </w:pPr>
-      <w:hyperlink w:anchor="_Toc231647868" w:history="1">
+      <w:hyperlink w:anchor="_Toc231727515" w:history="1">
         <w:r>
           <w:rPr>
             <w:rStyle w:val="aff8"/>
@@ -1196,7 +1243,7 @@
             <w:noProof/>
             <w:webHidden/>
           </w:rPr>
-          <w:instrText xml:space="preserve"> PAGEREF _Toc231647868 \h </w:instrText>
+          <w:instrText xml:space="preserve"> PAGEREF _Toc231727515 \h </w:instrText>
         </w:r>
         <w:r>
           <w:rPr>
@@ -1216,7 +1263,7 @@
             <w:noProof/>
             <w:webHidden/>
           </w:rPr>
-          <w:t>6</w:t>
+          <w:t>8</w:t>
         </w:r>
         <w:r>
           <w:rPr>
@@ -1237,7 +1284,7 @@
           <w:noProof/>
         </w:rPr>
       </w:pPr>
-      <w:hyperlink w:anchor="_Toc231647869" w:history="1">
+      <w:hyperlink w:anchor="_Toc231727516" w:history="1">
         <w:r>
           <w:rPr>
             <w:rStyle w:val="aff8"/>
@@ -1280,7 +1327,7 @@
             <w:noProof/>
             <w:webHidden/>
           </w:rPr>
-          <w:instrText xml:space="preserve"> PAGEREF _Toc231647869 \h </w:instrText>
+          <w:instrText xml:space="preserve"> PAGEREF _Toc231727516 \h </w:instrText>
         </w:r>
         <w:r>
           <w:rPr>
@@ -1300,7 +1347,7 @@
             <w:noProof/>
             <w:webHidden/>
           </w:rPr>
-          <w:t>7</w:t>
+          <w:t>9</w:t>
         </w:r>
         <w:r>
           <w:rPr>
@@ -1321,7 +1368,7 @@
           <w:noProof/>
         </w:rPr>
       </w:pPr>
-      <w:hyperlink w:anchor="_Toc231647870" w:history="1">
+      <w:hyperlink w:anchor="_Toc231727517" w:history="1">
         <w:r>
           <w:rPr>
             <w:rStyle w:val="aff8"/>
@@ -1349,7 +1396,7 @@
             <w:noProof/>
             <w:webHidden/>
           </w:rPr>
-          <w:instrText xml:space="preserve"> PAGEREF _Toc231647870 \h </w:instrText>
+          <w:instrText xml:space="preserve"> PAGEREF _Toc231727517 \h </w:instrText>
         </w:r>
         <w:r>
           <w:rPr>
@@ -1369,7 +1416,7 @@
             <w:noProof/>
             <w:webHidden/>
           </w:rPr>
-          <w:t>7</w:t>
+          <w:t>10</w:t>
         </w:r>
         <w:r>
           <w:rPr>
@@ -1390,7 +1437,7 @@
           <w:noProof/>
         </w:rPr>
       </w:pPr>
-      <w:hyperlink w:anchor="_Toc231647871" w:history="1">
+      <w:hyperlink w:anchor="_Toc231727518" w:history="1">
         <w:r>
           <w:rPr>
             <w:rStyle w:val="aff8"/>
@@ -1448,7 +1495,7 @@
             <w:noProof/>
             <w:webHidden/>
           </w:rPr>
-          <w:instrText xml:space="preserve"> PAGEREF _Toc231647871 \h </w:instrText>
+          <w:instrText xml:space="preserve"> PAGEREF _Toc231727518 \h </w:instrText>
         </w:r>
         <w:r>
           <w:rPr>
@@ -1468,7 +1515,7 @@
             <w:noProof/>
             <w:webHidden/>
           </w:rPr>
-          <w:t>8</w:t>
+          <w:t>10</w:t>
         </w:r>
         <w:r>
           <w:rPr>
@@ -1489,7 +1536,7 @@
           <w:noProof/>
         </w:rPr>
       </w:pPr>
-      <w:hyperlink w:anchor="_Toc231647872" w:history="1">
+      <w:hyperlink w:anchor="_Toc231727519" w:history="1">
         <w:r>
           <w:rPr>
             <w:rStyle w:val="aff8"/>
@@ -1517,7 +1564,7 @@
             <w:noProof/>
             <w:webHidden/>
           </w:rPr>
-          <w:instrText xml:space="preserve"> PAGEREF _Toc231647872 \h </w:instrText>
+          <w:instrText xml:space="preserve"> PAGEREF _Toc231727519 \h </w:instrText>
         </w:r>
         <w:r>
           <w:rPr>
@@ -1537,7 +1584,7 @@
             <w:noProof/>
             <w:webHidden/>
           </w:rPr>
-          <w:t>9</w:t>
+          <w:t>11</w:t>
         </w:r>
         <w:r>
           <w:rPr>
@@ -1558,7 +1605,7 @@
           <w:noProof/>
         </w:rPr>
       </w:pPr>
-      <w:hyperlink w:anchor="_Toc231647873" w:history="1">
+      <w:hyperlink w:anchor="_Toc231727520" w:history="1">
         <w:r>
           <w:rPr>
             <w:rStyle w:val="aff8"/>
@@ -1601,7 +1648,7 @@
             <w:noProof/>
             <w:webHidden/>
           </w:rPr>
-          <w:instrText xml:space="preserve"> PAGEREF _Toc231647873 \h </w:instrText>
+          <w:instrText xml:space="preserve"> PAGEREF _Toc231727520 \h </w:instrText>
         </w:r>
         <w:r>
           <w:rPr>
@@ -1621,7 +1668,7 @@
             <w:noProof/>
             <w:webHidden/>
           </w:rPr>
-          <w:t>9</w:t>
+          <w:t>11</w:t>
         </w:r>
         <w:r>
           <w:rPr>
@@ -1642,7 +1689,7 @@
           <w:noProof/>
         </w:rPr>
       </w:pPr>
-      <w:hyperlink w:anchor="_Toc231647874" w:history="1">
+      <w:hyperlink w:anchor="_Toc231727521" w:history="1">
         <w:r>
           <w:rPr>
             <w:rStyle w:val="aff8"/>
@@ -1670,7 +1717,7 @@
             <w:noProof/>
             <w:webHidden/>
           </w:rPr>
-          <w:instrText xml:space="preserve"> PAGEREF _Toc231647874 \h </w:instrText>
+          <w:instrText xml:space="preserve"> PAGEREF _Toc231727521 \h </w:instrText>
         </w:r>
         <w:r>
           <w:rPr>
@@ -1690,7 +1737,7 @@
             <w:noProof/>
             <w:webHidden/>
           </w:rPr>
-          <w:t>10</w:t>
+          <w:t>12</w:t>
         </w:r>
         <w:r>
           <w:rPr>
@@ -1711,7 +1758,7 @@
           <w:noProof/>
         </w:rPr>
       </w:pPr>
-      <w:hyperlink w:anchor="_Toc231647875" w:history="1">
+      <w:hyperlink w:anchor="_Toc231727522" w:history="1">
         <w:r>
           <w:rPr>
             <w:rStyle w:val="aff8"/>
@@ -1739,7 +1786,7 @@
             <w:noProof/>
             <w:webHidden/>
           </w:rPr>
-          <w:instrText xml:space="preserve"> PAGEREF _Toc231647875 \h </w:instrText>
+          <w:instrText xml:space="preserve"> PAGEREF _Toc231727522 \h </w:instrText>
         </w:r>
         <w:r>
           <w:rPr>
@@ -1759,7 +1806,7 @@
             <w:noProof/>
             <w:webHidden/>
           </w:rPr>
-          <w:t>10</w:t>
+          <w:t>12</w:t>
         </w:r>
         <w:r>
           <w:rPr>
@@ -1780,7 +1827,7 @@
           <w:noProof/>
         </w:rPr>
       </w:pPr>
-      <w:hyperlink w:anchor="_Toc231647876" w:history="1">
+      <w:hyperlink w:anchor="_Toc231727523" w:history="1">
         <w:r>
           <w:rPr>
             <w:rStyle w:val="aff8"/>
@@ -1808,7 +1855,7 @@
             <w:noProof/>
             <w:webHidden/>
           </w:rPr>
-          <w:instrText xml:space="preserve"> PAGEREF _Toc231647876 \h </w:instrText>
+          <w:instrText xml:space="preserve"> PAGEREF _Toc231727523 \h </w:instrText>
         </w:r>
         <w:r>
           <w:rPr>
@@ -1828,7 +1875,7 @@
             <w:noProof/>
             <w:webHidden/>
           </w:rPr>
-          <w:t>10</w:t>
+          <w:t>12</w:t>
         </w:r>
         <w:r>
           <w:rPr>
@@ -1872,7 +1919,7 @@
           <w:lang w:val="ru-RU"/>
         </w:rPr>
       </w:pPr>
-      <w:bookmarkStart w:id="0" w:name="_Toc231647857"/>
+      <w:bookmarkStart w:id="0" w:name="_Toc231727504"/>
       <w:r>
         <w:rPr>
           <w:lang w:val="ru-RU"/>
@@ -1888,9 +1935,11 @@
           <w:lang w:val="ru-RU"/>
         </w:rPr>
       </w:pPr>
+      <w:proofErr w:type="spellStart"/>
       <w:r>
         <w:t>MindeSync</w:t>
       </w:r>
+      <w:proofErr w:type="spellEnd"/>
       <w:r>
         <w:rPr>
           <w:lang w:val="ru-RU"/>
@@ -1946,14 +1995,30 @@
         </w:rPr>
         <w:t xml:space="preserve">, серверную часть на </w:t>
       </w:r>
+      <w:proofErr w:type="spellStart"/>
       <w:r>
         <w:t>FastAPI</w:t>
       </w:r>
-      <w:r>
-        <w:rPr>
-          <w:lang w:val="ru-RU"/>
-        </w:rPr>
-        <w:t xml:space="preserve">, локальные воркеры распознавания речи на базе </w:t>
+      <w:proofErr w:type="spellEnd"/>
+      <w:r>
+        <w:rPr>
+          <w:lang w:val="ru-RU"/>
+        </w:rPr>
+        <w:t xml:space="preserve">, локальные </w:t>
+      </w:r>
+      <w:proofErr w:type="spellStart"/>
+      <w:r>
+        <w:rPr>
+          <w:lang w:val="ru-RU"/>
+        </w:rPr>
+        <w:t>воркеры</w:t>
+      </w:r>
+      <w:proofErr w:type="spellEnd"/>
+      <w:r>
+        <w:rPr>
+          <w:lang w:val="ru-RU"/>
+        </w:rPr>
+        <w:t xml:space="preserve"> распознавания речи на базе </w:t>
       </w:r>
       <w:r>
         <w:t>Whisper</w:t>
@@ -1982,7 +2047,7 @@
           <w:lang w:val="ru-RU"/>
         </w:rPr>
       </w:pPr>
-      <w:bookmarkStart w:id="1" w:name="_Toc231647858"/>
+      <w:bookmarkStart w:id="1" w:name="_Toc231727505"/>
       <w:r>
         <w:rPr>
           <w:lang w:val="ru-RU"/>
@@ -2001,7 +2066,21 @@
         <w:rPr>
           <w:lang w:val="ru-RU"/>
         </w:rPr>
-        <w:t>Целью проекта является разработка веб-платформы, которая автоматизирует транскрибацию студенческих лекций и генерацию на их основе учебных материалов, а также обеспечивает совместную работу с этими материалами в рамках учебного потока.</w:t>
+        <w:t xml:space="preserve">Целью проекта является разработка веб-платформы, которая автоматизирует </w:t>
+      </w:r>
+      <w:proofErr w:type="spellStart"/>
+      <w:r>
+        <w:rPr>
+          <w:lang w:val="ru-RU"/>
+        </w:rPr>
+        <w:t>транскрибацию</w:t>
+      </w:r>
+      <w:proofErr w:type="spellEnd"/>
+      <w:r>
+        <w:rPr>
+          <w:lang w:val="ru-RU"/>
+        </w:rPr>
+        <w:t xml:space="preserve"> студенческих лекций и генерацию на их основе учебных материалов, а также обеспечивает совместную работу с этими материалами в рамках учебного потока.</w:t>
       </w:r>
     </w:p>
     <w:p>
@@ -2009,11 +2088,13 @@
         <w:pStyle w:val="21"/>
         <w:jc w:val="left"/>
       </w:pPr>
-      <w:bookmarkStart w:id="2" w:name="_Toc231647859"/>
+      <w:bookmarkStart w:id="2" w:name="_Toc231727506"/>
+      <w:proofErr w:type="spellStart"/>
       <w:r>
         <w:t>Задачи</w:t>
       </w:r>
       <w:bookmarkEnd w:id="2"/>
+      <w:proofErr w:type="spellEnd"/>
     </w:p>
     <w:p>
       <w:pPr>
@@ -2072,7 +2153,35 @@
         <w:rPr>
           <w:lang w:val="ru-RU"/>
         </w:rPr>
-        <w:t>Реализовать конвейер транскрибации аудио на отдельных воркер-машинах.</w:t>
+        <w:t xml:space="preserve">Реализовать конвейер </w:t>
+      </w:r>
+      <w:proofErr w:type="spellStart"/>
+      <w:r>
+        <w:rPr>
+          <w:lang w:val="ru-RU"/>
+        </w:rPr>
+        <w:t>транскрибации</w:t>
+      </w:r>
+      <w:proofErr w:type="spellEnd"/>
+      <w:r>
+        <w:rPr>
+          <w:lang w:val="ru-RU"/>
+        </w:rPr>
+        <w:t xml:space="preserve"> аудио на отдельных </w:t>
+      </w:r>
+      <w:proofErr w:type="spellStart"/>
+      <w:r>
+        <w:rPr>
+          <w:lang w:val="ru-RU"/>
+        </w:rPr>
+        <w:t>воркер</w:t>
+      </w:r>
+      <w:proofErr w:type="spellEnd"/>
+      <w:r>
+        <w:rPr>
+          <w:lang w:val="ru-RU"/>
+        </w:rPr>
+        <w:t>-машинах.</w:t>
       </w:r>
     </w:p>
     <w:p>
@@ -2138,28 +2247,10 @@
         <w:rPr>
           <w:lang w:val="ru-RU"/>
         </w:rPr>
-        <w:t xml:space="preserve">, </w:t>
+        <w:t xml:space="preserve"> и </w:t>
       </w:r>
       <w:r>
         <w:t>DOCX</w:t>
-      </w:r>
-      <w:r>
-        <w:rPr>
-          <w:lang w:val="ru-RU"/>
-        </w:rPr>
-        <w:t xml:space="preserve">, </w:t>
-      </w:r>
-      <w:r>
-        <w:t>MD</w:t>
-      </w:r>
-      <w:r>
-        <w:rPr>
-          <w:lang w:val="ru-RU"/>
-        </w:rPr>
-        <w:t xml:space="preserve">, </w:t>
-      </w:r>
-      <w:r>
-        <w:t>TXT</w:t>
       </w:r>
       <w:r>
         <w:rPr>
@@ -2176,7 +2267,7 @@
           <w:lang w:val="ru-RU"/>
         </w:rPr>
       </w:pPr>
-      <w:bookmarkStart w:id="3" w:name="_Toc231647860"/>
+      <w:bookmarkStart w:id="3" w:name="_Toc231727507"/>
       <w:r>
         <w:rPr>
           <w:lang w:val="ru-RU"/>
@@ -2206,7 +2297,7 @@
           <w:lang w:val="ru-RU"/>
         </w:rPr>
       </w:pPr>
-      <w:bookmarkStart w:id="4" w:name="_Toc231647861"/>
+      <w:bookmarkStart w:id="4" w:name="_Toc231727508"/>
       <w:r>
         <w:rPr>
           <w:lang w:val="ru-RU"/>
@@ -2264,88 +2355,112 @@
         <w:t xml:space="preserve"> и просматривает статистику системы.</w:t>
       </w:r>
     </w:p>
-    <w:tbl>
-      <w:tblPr>
-        <w:tblW w:w="0" w:type="auto"/>
-        <w:jc w:val="center"/>
-        <w:tblLook w:val="04A0" w:firstRow="1" w:lastRow="0" w:firstColumn="1" w:lastColumn="0" w:noHBand="0" w:noVBand="1"/>
-      </w:tblPr>
-      <w:tblGrid>
-        <w:gridCol w:w="9355"/>
-      </w:tblGrid>
-      <w:tr>
-        <w:trPr>
-          <w:jc w:val="center"/>
-        </w:trPr>
-        <w:tc>
-          <w:tcPr>
-            <w:tcW w:w="9355" w:type="dxa"/>
-            <w:tcBorders>
-              <w:top w:val="single" w:sz="6" w:space="0" w:color="808080"/>
-              <w:left w:val="single" w:sz="6" w:space="0" w:color="808080"/>
-              <w:bottom w:val="single" w:sz="6" w:space="0" w:color="808080"/>
-              <w:right w:val="single" w:sz="6" w:space="0" w:color="808080"/>
-            </w:tcBorders>
-          </w:tcPr>
-          <w:p>
-            <w:pPr>
-              <w:spacing w:before="360" w:after="360"/>
-              <w:ind w:firstLine="0"/>
-              <w:jc w:val="center"/>
-              <w:rPr>
-                <w:lang w:val="ru-RU"/>
-              </w:rPr>
-            </w:pPr>
-            <w:r>
-              <w:rPr>
-                <w:i/>
-                <w:color w:val="808080"/>
-                <w:sz w:val="24"/>
-                <w:lang w:val="ru-RU"/>
-              </w:rPr>
-              <w:t>[ Место для скриншота — главная страница (лендинг) платформы ]</w:t>
-            </w:r>
-          </w:p>
-        </w:tc>
-      </w:tr>
-    </w:tbl>
     <w:p>
       <w:pPr>
         <w:spacing w:before="40" w:after="160"/>
         <w:ind w:firstLine="0"/>
         <w:jc w:val="center"/>
         <w:rPr>
-          <w:lang w:val="ru-RU"/>
-        </w:rPr>
-      </w:pPr>
-      <w:r>
-        <w:rPr>
           <w:sz w:val="24"/>
           <w:lang w:val="ru-RU"/>
         </w:rPr>
-        <w:t xml:space="preserve">Рисунок 1. – Главная страница платформы </w:t>
-      </w:r>
-      <w:r>
-        <w:rPr>
+      </w:pPr>
+      <w:r>
+        <w:rPr>
+          <w:noProof/>
           <w:sz w:val="24"/>
-        </w:rPr>
-        <w:t>MindeSync</w:t>
+          <w:lang w:val="ru-RU"/>
+        </w:rPr>
+        <w:drawing>
+          <wp:inline distT="0" distB="0" distL="0" distR="0" wp14:anchorId="4E4D29DE" wp14:editId="0E6FA4EA">
+            <wp:extent cx="5940425" cy="3795395"/>
+            <wp:effectExtent l="0" t="0" r="3175" b="0"/>
+            <wp:docPr id="2113714432" name="Рисунок 1"/>
+            <wp:cNvGraphicFramePr>
+              <a:graphicFrameLocks xmlns:a="http://schemas.openxmlformats.org/drawingml/2006/main" noChangeAspect="1"/>
+            </wp:cNvGraphicFramePr>
+            <a:graphic xmlns:a="http://schemas.openxmlformats.org/drawingml/2006/main">
+              <a:graphicData uri="http://schemas.openxmlformats.org/drawingml/2006/picture">
+                <pic:pic xmlns:pic="http://schemas.openxmlformats.org/drawingml/2006/picture">
+                  <pic:nvPicPr>
+                    <pic:cNvPr id="2113714432" name=""/>
+                    <pic:cNvPicPr/>
+                  </pic:nvPicPr>
+                  <pic:blipFill>
+                    <a:blip r:embed="rId11"/>
+                    <a:stretch>
+                      <a:fillRect/>
+                    </a:stretch>
+                  </pic:blipFill>
+                  <pic:spPr>
+                    <a:xfrm>
+                      <a:off x="0" y="0"/>
+                      <a:ext cx="5940425" cy="3795395"/>
+                    </a:xfrm>
+                    <a:prstGeom prst="rect">
+                      <a:avLst/>
+                    </a:prstGeom>
+                  </pic:spPr>
+                </pic:pic>
+              </a:graphicData>
+            </a:graphic>
+          </wp:inline>
+        </w:drawing>
       </w:r>
     </w:p>
     <w:p>
       <w:pPr>
+        <w:spacing w:before="40" w:after="160"/>
+        <w:ind w:firstLine="0"/>
+        <w:jc w:val="center"/>
+        <w:rPr>
+          <w:lang w:val="ru-RU"/>
+        </w:rPr>
+      </w:pPr>
+      <w:r>
+        <w:rPr>
+          <w:sz w:val="24"/>
+          <w:lang w:val="ru-RU"/>
+        </w:rPr>
+        <w:t xml:space="preserve">Рисунок 1. – Главная страница платформы </w:t>
+      </w:r>
+      <w:proofErr w:type="spellStart"/>
+      <w:r>
+        <w:rPr>
+          <w:sz w:val="24"/>
+        </w:rPr>
+        <w:t>MindeSync</w:t>
+      </w:r>
+      <w:proofErr w:type="spellEnd"/>
+    </w:p>
+    <w:p>
+      <w:pPr>
         <w:pStyle w:val="21"/>
         <w:jc w:val="left"/>
         <w:rPr>
           <w:lang w:val="ru-RU"/>
         </w:rPr>
       </w:pPr>
-      <w:bookmarkStart w:id="5" w:name="_Toc231647862"/>
-      <w:r>
-        <w:rPr>
-          <w:lang w:val="ru-RU"/>
-        </w:rPr>
-        <w:t>2.2. Загрузка и транскрибация лекций</w:t>
+      <w:bookmarkStart w:id="5" w:name="_Toc231727509"/>
+      <w:r>
+        <w:rPr>
+          <w:lang w:val="ru-RU"/>
+        </w:rPr>
+        <w:t xml:space="preserve">2.2. Загрузка и </w:t>
+      </w:r>
+      <w:proofErr w:type="spellStart"/>
+      <w:r>
+        <w:rPr>
+          <w:lang w:val="ru-RU"/>
+        </w:rPr>
+        <w:t>транскрибация</w:t>
+      </w:r>
+      <w:proofErr w:type="spellEnd"/>
+      <w:r>
+        <w:rPr>
+          <w:lang w:val="ru-RU"/>
+        </w:rPr>
+        <w:t xml:space="preserve"> лекций</w:t>
       </w:r>
       <w:bookmarkEnd w:id="5"/>
     </w:p>
@@ -2356,9 +2471,11 @@
         </w:rPr>
         <w:t xml:space="preserve">Пользователь загружает аудио- или видеозапись лекции (поддерживаются форматы </w:t>
       </w:r>
+      <w:proofErr w:type="spellStart"/>
       <w:r>
         <w:t>mp</w:t>
       </w:r>
+      <w:proofErr w:type="spellEnd"/>
       <w:r>
         <w:rPr>
           <w:lang w:val="ru-RU"/>
@@ -2392,32 +2509,59 @@
         </w:rPr>
         <w:t xml:space="preserve">, </w:t>
       </w:r>
+      <w:proofErr w:type="spellStart"/>
       <w:r>
         <w:t>mp</w:t>
       </w:r>
+      <w:proofErr w:type="spellEnd"/>
       <w:r>
         <w:rPr>
           <w:lang w:val="ru-RU"/>
         </w:rPr>
         <w:t xml:space="preserve">4, </w:t>
       </w:r>
+      <w:proofErr w:type="spellStart"/>
       <w:r>
         <w:t>mkv</w:t>
       </w:r>
+      <w:proofErr w:type="spellEnd"/>
       <w:r>
         <w:rPr>
           <w:lang w:val="ru-RU"/>
         </w:rPr>
         <w:t xml:space="preserve">, </w:t>
       </w:r>
+      <w:proofErr w:type="spellStart"/>
       <w:r>
         <w:t>webm</w:t>
       </w:r>
-      <w:r>
-        <w:rPr>
-          <w:lang w:val="ru-RU"/>
-        </w:rPr>
-        <w:t xml:space="preserve"> размером до 100 МБ). Файл не обрабатывается на сервере — он помещается в очередь задач, откуда его забирает воркер с поддержкой </w:t>
+      <w:proofErr w:type="spellEnd"/>
+      <w:r>
+        <w:rPr>
+          <w:lang w:val="ru-RU"/>
+        </w:rPr>
+        <w:t xml:space="preserve"> размером до 100 </w:t>
+      </w:r>
+      <w:r>
+        <w:rPr>
+          <w:lang w:val="ru-RU"/>
+        </w:rPr>
+        <w:lastRenderedPageBreak/>
+        <w:t xml:space="preserve">МБ). Файл не обрабатывается на сервере — он помещается в очередь задач, откуда его забирает </w:t>
+      </w:r>
+      <w:proofErr w:type="spellStart"/>
+      <w:r>
+        <w:rPr>
+          <w:lang w:val="ru-RU"/>
+        </w:rPr>
+        <w:t>воркер</w:t>
+      </w:r>
+      <w:proofErr w:type="spellEnd"/>
+      <w:r>
+        <w:rPr>
+          <w:lang w:val="ru-RU"/>
+        </w:rPr>
+        <w:t xml:space="preserve"> с поддержкой </w:t>
       </w:r>
       <w:r>
         <w:t>GPU</w:t>
@@ -2435,88 +2579,116 @@
         <w:rPr>
           <w:lang w:val="ru-RU"/>
         </w:rPr>
-        <w:t xml:space="preserve"> локально на воркере, после чего готовый текст возвращается на сервер. </w:t>
+        <w:t xml:space="preserve"> локально на </w:t>
+      </w:r>
+      <w:proofErr w:type="spellStart"/>
+      <w:r>
+        <w:rPr>
+          <w:lang w:val="ru-RU"/>
+        </w:rPr>
+        <w:t>воркере</w:t>
+      </w:r>
+      <w:proofErr w:type="spellEnd"/>
+      <w:r>
+        <w:rPr>
+          <w:lang w:val="ru-RU"/>
+        </w:rPr>
+        <w:t xml:space="preserve">, после чего готовый текст возвращается на сервер. </w:t>
       </w:r>
       <w:r>
         <w:t>Пользователь видит статус задачи в реальном времени.</w:t>
       </w:r>
     </w:p>
-    <w:tbl>
-      <w:tblPr>
-        <w:tblW w:w="0" w:type="auto"/>
-        <w:jc w:val="center"/>
-        <w:tblLook w:val="04A0" w:firstRow="1" w:lastRow="0" w:firstColumn="1" w:lastColumn="0" w:noHBand="0" w:noVBand="1"/>
-      </w:tblPr>
-      <w:tblGrid>
-        <w:gridCol w:w="9355"/>
-      </w:tblGrid>
-      <w:tr>
-        <w:trPr>
-          <w:jc w:val="center"/>
-        </w:trPr>
-        <w:tc>
-          <w:tcPr>
-            <w:tcW w:w="9355" w:type="dxa"/>
-            <w:tcBorders>
-              <w:top w:val="single" w:sz="6" w:space="0" w:color="808080"/>
-              <w:left w:val="single" w:sz="6" w:space="0" w:color="808080"/>
-              <w:bottom w:val="single" w:sz="6" w:space="0" w:color="808080"/>
-              <w:right w:val="single" w:sz="6" w:space="0" w:color="808080"/>
-            </w:tcBorders>
-          </w:tcPr>
-          <w:p>
-            <w:pPr>
-              <w:spacing w:before="360" w:after="360"/>
-              <w:ind w:firstLine="0"/>
-              <w:jc w:val="center"/>
-              <w:rPr>
-                <w:lang w:val="ru-RU"/>
-              </w:rPr>
-            </w:pPr>
-            <w:r>
-              <w:rPr>
-                <w:i/>
-                <w:color w:val="808080"/>
-                <w:sz w:val="24"/>
-                <w:lang w:val="ru-RU"/>
-              </w:rPr>
-              <w:t>[ Место для скриншота — секция «Транскрайбер» в личном кабинете ]</w:t>
-            </w:r>
-          </w:p>
-        </w:tc>
-      </w:tr>
-    </w:tbl>
     <w:p>
       <w:pPr>
         <w:spacing w:before="40" w:after="160"/>
         <w:ind w:firstLine="0"/>
         <w:jc w:val="center"/>
         <w:rPr>
-          <w:lang w:val="ru-RU"/>
-        </w:rPr>
-      </w:pPr>
-      <w:r>
-        <w:rPr>
           <w:sz w:val="24"/>
           <w:lang w:val="ru-RU"/>
         </w:rPr>
-        <w:t>Рисунок 2. – Загрузка лекции и статус транскрибации</w:t>
+      </w:pPr>
+      <w:r>
+        <w:rPr>
+          <w:noProof/>
+          <w:sz w:val="24"/>
+          <w:lang w:val="ru-RU"/>
+        </w:rPr>
+        <w:drawing>
+          <wp:inline distT="0" distB="0" distL="0" distR="0" wp14:anchorId="6B364ED1" wp14:editId="776E5CF2">
+            <wp:extent cx="5940425" cy="1699260"/>
+            <wp:effectExtent l="0" t="0" r="3175" b="0"/>
+            <wp:docPr id="1337299353" name="Рисунок 1"/>
+            <wp:cNvGraphicFramePr>
+              <a:graphicFrameLocks xmlns:a="http://schemas.openxmlformats.org/drawingml/2006/main" noChangeAspect="1"/>
+            </wp:cNvGraphicFramePr>
+            <a:graphic xmlns:a="http://schemas.openxmlformats.org/drawingml/2006/main">
+              <a:graphicData uri="http://schemas.openxmlformats.org/drawingml/2006/picture">
+                <pic:pic xmlns:pic="http://schemas.openxmlformats.org/drawingml/2006/picture">
+                  <pic:nvPicPr>
+                    <pic:cNvPr id="1337299353" name=""/>
+                    <pic:cNvPicPr/>
+                  </pic:nvPicPr>
+                  <pic:blipFill>
+                    <a:blip r:embed="rId12"/>
+                    <a:stretch>
+                      <a:fillRect/>
+                    </a:stretch>
+                  </pic:blipFill>
+                  <pic:spPr>
+                    <a:xfrm>
+                      <a:off x="0" y="0"/>
+                      <a:ext cx="5940425" cy="1699260"/>
+                    </a:xfrm>
+                    <a:prstGeom prst="rect">
+                      <a:avLst/>
+                    </a:prstGeom>
+                  </pic:spPr>
+                </pic:pic>
+              </a:graphicData>
+            </a:graphic>
+          </wp:inline>
+        </w:drawing>
       </w:r>
     </w:p>
     <w:p>
       <w:pPr>
+        <w:spacing w:before="40" w:after="160"/>
+        <w:ind w:firstLine="0"/>
+        <w:jc w:val="center"/>
+        <w:rPr>
+          <w:lang w:val="ru-RU"/>
+        </w:rPr>
+      </w:pPr>
+      <w:r>
+        <w:rPr>
+          <w:sz w:val="24"/>
+          <w:lang w:val="ru-RU"/>
+        </w:rPr>
+        <w:t xml:space="preserve">Рисунок 2. – </w:t>
+      </w:r>
+      <w:r>
+        <w:rPr>
+          <w:sz w:val="24"/>
+          <w:lang w:val="ru-RU"/>
+        </w:rPr>
+        <w:t>Загруженные лекции</w:t>
+      </w:r>
+    </w:p>
+    <w:p>
+      <w:pPr>
         <w:pStyle w:val="21"/>
         <w:jc w:val="left"/>
         <w:rPr>
           <w:lang w:val="ru-RU"/>
         </w:rPr>
       </w:pPr>
-      <w:bookmarkStart w:id="6" w:name="_Toc231647863"/>
-      <w:r>
-        <w:rPr>
-          <w:lang w:val="ru-RU"/>
-        </w:rPr>
-        <w:lastRenderedPageBreak/>
+      <w:bookmarkStart w:id="6" w:name="_Toc231727510"/>
+      <w:r>
+        <w:rPr>
+          <w:lang w:val="ru-RU"/>
+        </w:rPr>
         <w:t>2.3. Генерация учебных материалов</w:t>
       </w:r>
       <w:bookmarkEnd w:id="6"/>
@@ -2543,77 +2715,86 @@
         <w:t>-фильтром (исправление ошибок распознавания, слов-паразитов, пунктуации) и передать языковой модели для генерации материалов. Поддерживаются режимы: краткий конспект, выделение терминов, расширенное объяснение темы, генерация контрольных вопросов, подробный конспект и шпаргалка. Несколько материалов могут генерироваться параллельно; объём генераций ограничен квотой выбранного тарифа.</w:t>
       </w:r>
     </w:p>
-    <w:tbl>
-      <w:tblPr>
-        <w:tblW w:w="0" w:type="auto"/>
-        <w:jc w:val="center"/>
-        <w:tblLook w:val="04A0" w:firstRow="1" w:lastRow="0" w:firstColumn="1" w:lastColumn="0" w:noHBand="0" w:noVBand="1"/>
-      </w:tblPr>
-      <w:tblGrid>
-        <w:gridCol w:w="9355"/>
-      </w:tblGrid>
-      <w:tr>
-        <w:trPr>
-          <w:jc w:val="center"/>
-        </w:trPr>
-        <w:tc>
-          <w:tcPr>
-            <w:tcW w:w="9355" w:type="dxa"/>
-            <w:tcBorders>
-              <w:top w:val="single" w:sz="6" w:space="0" w:color="808080"/>
-              <w:left w:val="single" w:sz="6" w:space="0" w:color="808080"/>
-              <w:bottom w:val="single" w:sz="6" w:space="0" w:color="808080"/>
-              <w:right w:val="single" w:sz="6" w:space="0" w:color="808080"/>
-            </w:tcBorders>
-          </w:tcPr>
-          <w:p>
-            <w:pPr>
-              <w:spacing w:before="360" w:after="360"/>
-              <w:ind w:firstLine="0"/>
-              <w:jc w:val="center"/>
-              <w:rPr>
-                <w:lang w:val="ru-RU"/>
-              </w:rPr>
-            </w:pPr>
-            <w:r>
-              <w:rPr>
-                <w:i/>
-                <w:color w:val="808080"/>
-                <w:sz w:val="24"/>
-                <w:lang w:val="ru-RU"/>
-              </w:rPr>
-              <w:t>[ Место для скриншота — секция «Лекции» с результатами генерации материалов ]</w:t>
-            </w:r>
-          </w:p>
-        </w:tc>
-      </w:tr>
-    </w:tbl>
     <w:p>
       <w:pPr>
         <w:spacing w:before="40" w:after="160"/>
         <w:ind w:firstLine="0"/>
         <w:jc w:val="center"/>
         <w:rPr>
-          <w:lang w:val="ru-RU"/>
-        </w:rPr>
-      </w:pPr>
-      <w:r>
-        <w:rPr>
           <w:sz w:val="24"/>
           <w:lang w:val="ru-RU"/>
         </w:rPr>
-        <w:t>Рисунок 3. – Сгенерированные учебные материалы по лекции</w:t>
+      </w:pPr>
+      <w:r>
+        <w:rPr>
+          <w:noProof/>
+          <w:sz w:val="24"/>
+          <w:lang w:val="ru-RU"/>
+        </w:rPr>
+        <w:lastRenderedPageBreak/>
+        <w:drawing>
+          <wp:inline distT="0" distB="0" distL="0" distR="0" wp14:anchorId="7D4AC306" wp14:editId="340FE6A3">
+            <wp:extent cx="4476750" cy="5170156"/>
+            <wp:effectExtent l="0" t="0" r="0" b="0"/>
+            <wp:docPr id="370960378" name="Рисунок 1"/>
+            <wp:cNvGraphicFramePr>
+              <a:graphicFrameLocks xmlns:a="http://schemas.openxmlformats.org/drawingml/2006/main" noChangeAspect="1"/>
+            </wp:cNvGraphicFramePr>
+            <a:graphic xmlns:a="http://schemas.openxmlformats.org/drawingml/2006/main">
+              <a:graphicData uri="http://schemas.openxmlformats.org/drawingml/2006/picture">
+                <pic:pic xmlns:pic="http://schemas.openxmlformats.org/drawingml/2006/picture">
+                  <pic:nvPicPr>
+                    <pic:cNvPr id="370960378" name=""/>
+                    <pic:cNvPicPr/>
+                  </pic:nvPicPr>
+                  <pic:blipFill>
+                    <a:blip r:embed="rId13"/>
+                    <a:stretch>
+                      <a:fillRect/>
+                    </a:stretch>
+                  </pic:blipFill>
+                  <pic:spPr>
+                    <a:xfrm>
+                      <a:off x="0" y="0"/>
+                      <a:ext cx="4482899" cy="5177257"/>
+                    </a:xfrm>
+                    <a:prstGeom prst="rect">
+                      <a:avLst/>
+                    </a:prstGeom>
+                  </pic:spPr>
+                </pic:pic>
+              </a:graphicData>
+            </a:graphic>
+          </wp:inline>
+        </w:drawing>
       </w:r>
     </w:p>
     <w:p>
       <w:pPr>
+        <w:spacing w:before="40" w:after="160"/>
+        <w:ind w:firstLine="0"/>
+        <w:jc w:val="center"/>
+        <w:rPr>
+          <w:lang w:val="ru-RU"/>
+        </w:rPr>
+      </w:pPr>
+      <w:r>
+        <w:rPr>
+          <w:sz w:val="24"/>
+          <w:lang w:val="ru-RU"/>
+        </w:rPr>
+        <w:t>Рисунок 3. – Сгенерированные учебные материалы по лекции</w:t>
+      </w:r>
+    </w:p>
+    <w:p>
+      <w:pPr>
         <w:pStyle w:val="21"/>
         <w:jc w:val="left"/>
         <w:rPr>
           <w:lang w:val="ru-RU"/>
         </w:rPr>
       </w:pPr>
-      <w:bookmarkStart w:id="7" w:name="_Toc231647864"/>
+      <w:bookmarkStart w:id="7" w:name="_Toc231727511"/>
       <w:r>
         <w:rPr>
           <w:lang w:val="ru-RU"/>
@@ -2634,9 +2815,11 @@
         </w:rPr>
         <w:t xml:space="preserve">Готовые лекции можно опубликовать в общий каталог дисциплин, организованный по иерархии «факультет → направление → поток → семестр». Публикация проходит модерацию старостой потока или администратором. Помимо каталога, в системе есть совместные доски на базе </w:t>
       </w:r>
+      <w:proofErr w:type="spellStart"/>
       <w:r>
         <w:t>Excalidraw</w:t>
       </w:r>
+      <w:proofErr w:type="spellEnd"/>
       <w:r>
         <w:rPr>
           <w:lang w:val="ru-RU"/>
@@ -2644,77 +2827,86 @@
         <w:t xml:space="preserve"> с режимами совместного просмотра и редактирования в реальном времени.</w:t>
       </w:r>
     </w:p>
-    <w:tbl>
-      <w:tblPr>
-        <w:tblW w:w="0" w:type="auto"/>
-        <w:jc w:val="center"/>
-        <w:tblLook w:val="04A0" w:firstRow="1" w:lastRow="0" w:firstColumn="1" w:lastColumn="0" w:noHBand="0" w:noVBand="1"/>
-      </w:tblPr>
-      <w:tblGrid>
-        <w:gridCol w:w="9355"/>
-      </w:tblGrid>
-      <w:tr>
-        <w:trPr>
-          <w:jc w:val="center"/>
-        </w:trPr>
-        <w:tc>
-          <w:tcPr>
-            <w:tcW w:w="9355" w:type="dxa"/>
-            <w:tcBorders>
-              <w:top w:val="single" w:sz="6" w:space="0" w:color="808080"/>
-              <w:left w:val="single" w:sz="6" w:space="0" w:color="808080"/>
-              <w:bottom w:val="single" w:sz="6" w:space="0" w:color="808080"/>
-              <w:right w:val="single" w:sz="6" w:space="0" w:color="808080"/>
-            </w:tcBorders>
-          </w:tcPr>
-          <w:p>
-            <w:pPr>
-              <w:spacing w:before="360" w:after="360"/>
-              <w:ind w:firstLine="0"/>
-              <w:jc w:val="center"/>
-              <w:rPr>
-                <w:lang w:val="ru-RU"/>
-              </w:rPr>
-            </w:pPr>
-            <w:r>
-              <w:rPr>
-                <w:i/>
-                <w:color w:val="808080"/>
-                <w:sz w:val="24"/>
-                <w:lang w:val="ru-RU"/>
-              </w:rPr>
-              <w:t>[ Место для скриншота — каталог дисциплин учебного потока ]</w:t>
-            </w:r>
-          </w:p>
-        </w:tc>
-      </w:tr>
-    </w:tbl>
     <w:p>
       <w:pPr>
         <w:spacing w:before="40" w:after="160"/>
         <w:ind w:firstLine="0"/>
         <w:jc w:val="center"/>
         <w:rPr>
-          <w:lang w:val="ru-RU"/>
-        </w:rPr>
-      </w:pPr>
-      <w:r>
-        <w:rPr>
           <w:sz w:val="24"/>
           <w:lang w:val="ru-RU"/>
         </w:rPr>
-        <w:t>Рисунок 4. – Каталог дисциплин</w:t>
+      </w:pPr>
+      <w:r>
+        <w:rPr>
+          <w:noProof/>
+          <w:sz w:val="24"/>
+          <w:lang w:val="ru-RU"/>
+        </w:rPr>
+        <w:lastRenderedPageBreak/>
+        <w:drawing>
+          <wp:inline distT="0" distB="0" distL="0" distR="0" wp14:anchorId="068930DC" wp14:editId="3E74514D">
+            <wp:extent cx="5940425" cy="4196715"/>
+            <wp:effectExtent l="0" t="0" r="3175" b="0"/>
+            <wp:docPr id="855305317" name="Рисунок 1"/>
+            <wp:cNvGraphicFramePr>
+              <a:graphicFrameLocks xmlns:a="http://schemas.openxmlformats.org/drawingml/2006/main" noChangeAspect="1"/>
+            </wp:cNvGraphicFramePr>
+            <a:graphic xmlns:a="http://schemas.openxmlformats.org/drawingml/2006/main">
+              <a:graphicData uri="http://schemas.openxmlformats.org/drawingml/2006/picture">
+                <pic:pic xmlns:pic="http://schemas.openxmlformats.org/drawingml/2006/picture">
+                  <pic:nvPicPr>
+                    <pic:cNvPr id="855305317" name=""/>
+                    <pic:cNvPicPr/>
+                  </pic:nvPicPr>
+                  <pic:blipFill>
+                    <a:blip r:embed="rId14"/>
+                    <a:stretch>
+                      <a:fillRect/>
+                    </a:stretch>
+                  </pic:blipFill>
+                  <pic:spPr>
+                    <a:xfrm>
+                      <a:off x="0" y="0"/>
+                      <a:ext cx="5940425" cy="4196715"/>
+                    </a:xfrm>
+                    <a:prstGeom prst="rect">
+                      <a:avLst/>
+                    </a:prstGeom>
+                  </pic:spPr>
+                </pic:pic>
+              </a:graphicData>
+            </a:graphic>
+          </wp:inline>
+        </w:drawing>
       </w:r>
     </w:p>
     <w:p>
       <w:pPr>
+        <w:spacing w:before="40" w:after="160"/>
+        <w:ind w:firstLine="0"/>
+        <w:jc w:val="center"/>
+        <w:rPr>
+          <w:lang w:val="ru-RU"/>
+        </w:rPr>
+      </w:pPr>
+      <w:r>
+        <w:rPr>
+          <w:sz w:val="24"/>
+          <w:lang w:val="ru-RU"/>
+        </w:rPr>
+        <w:t>Рисунок 4. – Каталог дисциплин</w:t>
+      </w:r>
+    </w:p>
+    <w:p>
+      <w:pPr>
         <w:pStyle w:val="21"/>
         <w:jc w:val="left"/>
         <w:rPr>
           <w:lang w:val="ru-RU"/>
         </w:rPr>
       </w:pPr>
-      <w:bookmarkStart w:id="8" w:name="_Toc231647865"/>
+      <w:bookmarkStart w:id="8" w:name="_Toc231727512"/>
       <w:r>
         <w:rPr>
           <w:lang w:val="ru-RU"/>
@@ -2780,12 +2972,11 @@
           <w:lang w:val="ru-RU"/>
         </w:rPr>
       </w:pPr>
-      <w:bookmarkStart w:id="9" w:name="_Toc231647866"/>
-      <w:r>
-        <w:rPr>
-          <w:lang w:val="ru-RU"/>
-        </w:rPr>
-        <w:lastRenderedPageBreak/>
+      <w:bookmarkStart w:id="9" w:name="_Toc231727513"/>
+      <w:r>
+        <w:rPr>
+          <w:lang w:val="ru-RU"/>
+        </w:rPr>
         <w:t>3. Техническая реализация</w:t>
       </w:r>
       <w:bookmarkEnd w:id="9"/>
@@ -2811,7 +3002,7 @@
           <w:lang w:val="ru-RU"/>
         </w:rPr>
       </w:pPr>
-      <w:bookmarkStart w:id="10" w:name="_Toc231647867"/>
+      <w:bookmarkStart w:id="10" w:name="_Toc231727514"/>
       <w:r>
         <w:rPr>
           <w:lang w:val="ru-RU"/>
@@ -2875,7 +3066,28 @@
         <w:rPr>
           <w:lang w:val="ru-RU"/>
         </w:rPr>
-        <w:t xml:space="preserve"> для вспомогательных задач (отзыв токенов, синхронизация досок). Тяжёлые операции вынесены в отдельные сервисы: распознавание речи — на воркер-машины с </w:t>
+        <w:t xml:space="preserve"> для вспомогательных задач (отзыв токенов, синхронизация досок). Тяжёлые </w:t>
+      </w:r>
+      <w:r>
+        <w:rPr>
+          <w:lang w:val="ru-RU"/>
+        </w:rPr>
+        <w:lastRenderedPageBreak/>
+        <w:t xml:space="preserve">операции вынесены в отдельные сервисы: распознавание речи — на </w:t>
+      </w:r>
+      <w:proofErr w:type="spellStart"/>
+      <w:r>
+        <w:rPr>
+          <w:lang w:val="ru-RU"/>
+        </w:rPr>
+        <w:t>воркер</w:t>
+      </w:r>
+      <w:proofErr w:type="spellEnd"/>
+      <w:r>
+        <w:rPr>
+          <w:lang w:val="ru-RU"/>
+        </w:rPr>
+        <w:t xml:space="preserve">-машины с </w:t>
       </w:r>
       <w:r>
         <w:t>GPU</w:t>
@@ -2887,51 +3099,53 @@
         <w:t>, генерация документов — в отдельный сервис экспорта.</w:t>
       </w:r>
     </w:p>
-    <w:tbl>
-      <w:tblPr>
-        <w:tblW w:w="0" w:type="auto"/>
+    <w:p>
+      <w:pPr>
+        <w:spacing w:before="120"/>
+        <w:ind w:firstLine="0"/>
         <w:jc w:val="center"/>
-        <w:tblLook w:val="04A0" w:firstRow="1" w:lastRow="0" w:firstColumn="1" w:lastColumn="0" w:noHBand="0" w:noVBand="1"/>
-      </w:tblPr>
-      <w:tblGrid>
-        <w:gridCol w:w="9355"/>
-      </w:tblGrid>
-      <w:tr>
-        <w:trPr>
-          <w:jc w:val="center"/>
-        </w:trPr>
-        <w:tc>
-          <w:tcPr>
-            <w:tcW w:w="9355" w:type="dxa"/>
-            <w:tcBorders>
-              <w:top w:val="single" w:sz="6" w:space="0" w:color="808080"/>
-              <w:left w:val="single" w:sz="6" w:space="0" w:color="808080"/>
-              <w:bottom w:val="single" w:sz="6" w:space="0" w:color="808080"/>
-              <w:right w:val="single" w:sz="6" w:space="0" w:color="808080"/>
-            </w:tcBorders>
-          </w:tcPr>
-          <w:p>
-            <w:pPr>
-              <w:spacing w:before="360" w:after="360"/>
-              <w:ind w:firstLine="0"/>
-              <w:jc w:val="center"/>
-              <w:rPr>
-                <w:lang w:val="ru-RU"/>
-              </w:rPr>
-            </w:pPr>
-            <w:r>
-              <w:rPr>
-                <w:i/>
-                <w:color w:val="808080"/>
-                <w:sz w:val="24"/>
-                <w:lang w:val="ru-RU"/>
-              </w:rPr>
-              <w:t>[ Место для скриншота — схема архитектуры (компоненты и связи между ними) ]</w:t>
-            </w:r>
-          </w:p>
-        </w:tc>
-      </w:tr>
-    </w:tbl>
+      </w:pPr>
+      <w:r>
+        <w:rPr>
+          <w:noProof/>
+        </w:rPr>
+        <w:drawing>
+          <wp:inline distT="0" distB="0" distL="0" distR="0" wp14:anchorId="7E95F3B4" wp14:editId="59B32C10">
+            <wp:extent cx="5580000" cy="3673367"/>
+            <wp:effectExtent l="0" t="0" r="0" b="0"/>
+            <wp:docPr id="1" name="Picture 1"/>
+            <wp:cNvGraphicFramePr>
+              <a:graphicFrameLocks xmlns:a="http://schemas.openxmlformats.org/drawingml/2006/main" noChangeAspect="1"/>
+            </wp:cNvGraphicFramePr>
+            <a:graphic xmlns:a="http://schemas.openxmlformats.org/drawingml/2006/main">
+              <a:graphicData uri="http://schemas.openxmlformats.org/drawingml/2006/picture">
+                <pic:pic xmlns:pic="http://schemas.openxmlformats.org/drawingml/2006/picture">
+                  <pic:nvPicPr>
+                    <pic:cNvPr id="0" name="architecture.png"/>
+                    <pic:cNvPicPr/>
+                  </pic:nvPicPr>
+                  <pic:blipFill>
+                    <a:blip r:embed="rId15"/>
+                    <a:stretch>
+                      <a:fillRect/>
+                    </a:stretch>
+                  </pic:blipFill>
+                  <pic:spPr>
+                    <a:xfrm>
+                      <a:off x="0" y="0"/>
+                      <a:ext cx="5580000" cy="3673367"/>
+                    </a:xfrm>
+                    <a:prstGeom prst="rect">
+                      <a:avLst/>
+                    </a:prstGeom>
+                  </pic:spPr>
+                </pic:pic>
+              </a:graphicData>
+            </a:graphic>
+          </wp:inline>
+        </w:drawing>
+      </w:r>
+    </w:p>
     <w:p>
       <w:pPr>
         <w:spacing w:before="40" w:after="160"/>
@@ -3019,11 +3233,19 @@
           <w:lang w:val="ru-RU"/>
         </w:rPr>
       </w:pPr>
-      <w:r>
-        <w:rPr>
-          <w:lang w:val="ru-RU"/>
-        </w:rPr>
-        <w:t>Воркеры (</w:t>
+      <w:proofErr w:type="spellStart"/>
+      <w:r>
+        <w:rPr>
+          <w:lang w:val="ru-RU"/>
+        </w:rPr>
+        <w:t>Воркеры</w:t>
+      </w:r>
+      <w:proofErr w:type="spellEnd"/>
+      <w:r>
+        <w:rPr>
+          <w:lang w:val="ru-RU"/>
+        </w:rPr>
+        <w:t xml:space="preserve"> (</w:t>
       </w:r>
       <w:r>
         <w:t>Whisper</w:t>
@@ -3057,9 +3279,11 @@
         </w:rPr>
         <w:t>.</w:t>
       </w:r>
+      <w:proofErr w:type="spellStart"/>
       <w:r>
         <w:t>js</w:t>
       </w:r>
+      <w:proofErr w:type="spellEnd"/>
       <w:r>
         <w:rPr>
           <w:lang w:val="ru-RU"/>
@@ -3110,7 +3334,7 @@
           <w:lang w:val="ru-RU"/>
         </w:rPr>
       </w:pPr>
-      <w:bookmarkStart w:id="11" w:name="_Toc231647868"/>
+      <w:bookmarkStart w:id="11" w:name="_Toc231727515"/>
       <w:r>
         <w:rPr>
           <w:lang w:val="ru-RU"/>
@@ -3167,18 +3391,22 @@
         </w:rPr>
         <w:t xml:space="preserve">, </w:t>
       </w:r>
+      <w:proofErr w:type="spellStart"/>
       <w:r>
         <w:t>TipTap</w:t>
       </w:r>
+      <w:proofErr w:type="spellEnd"/>
       <w:r>
         <w:rPr>
           <w:lang w:val="ru-RU"/>
         </w:rPr>
         <w:t xml:space="preserve"> (редактор текста), </w:t>
       </w:r>
+      <w:proofErr w:type="spellStart"/>
       <w:r>
         <w:t>Excalidraw</w:t>
       </w:r>
+      <w:proofErr w:type="spellEnd"/>
       <w:r>
         <w:rPr>
           <w:lang w:val="ru-RU"/>
@@ -3203,36 +3431,44 @@
         </w:rPr>
         <w:t xml:space="preserve">, </w:t>
       </w:r>
+      <w:proofErr w:type="spellStart"/>
       <w:r>
         <w:t>KaTeX</w:t>
       </w:r>
+      <w:proofErr w:type="spellEnd"/>
       <w:r>
         <w:rPr>
           <w:lang w:val="ru-RU"/>
         </w:rPr>
         <w:t xml:space="preserve"> (формулы). Серверная часть: </w:t>
       </w:r>
+      <w:proofErr w:type="spellStart"/>
       <w:r>
         <w:t>FastAPI</w:t>
       </w:r>
+      <w:proofErr w:type="spellEnd"/>
       <w:r>
         <w:rPr>
           <w:lang w:val="ru-RU"/>
         </w:rPr>
         <w:t xml:space="preserve">, </w:t>
       </w:r>
+      <w:proofErr w:type="spellStart"/>
       <w:r>
         <w:t>SQLAlchemy</w:t>
       </w:r>
+      <w:proofErr w:type="spellEnd"/>
       <w:r>
         <w:rPr>
           <w:lang w:val="ru-RU"/>
         </w:rPr>
         <w:t xml:space="preserve"> 2.0 (асинхронный режим), </w:t>
       </w:r>
+      <w:proofErr w:type="spellStart"/>
       <w:r>
         <w:t>asyncpg</w:t>
       </w:r>
+      <w:proofErr w:type="spellEnd"/>
       <w:r>
         <w:rPr>
           <w:lang w:val="ru-RU"/>
@@ -3248,9 +3484,11 @@
         </w:rPr>
         <w:t xml:space="preserve"> (миграции), </w:t>
       </w:r>
+      <w:proofErr w:type="spellStart"/>
       <w:r>
         <w:t>Pydantic</w:t>
       </w:r>
+      <w:proofErr w:type="spellEnd"/>
       <w:r>
         <w:rPr>
           <w:lang w:val="ru-RU"/>
@@ -3276,6 +3514,7 @@
         <w:t xml:space="preserve"> 16 и </w:t>
       </w:r>
       <w:r>
+        <w:lastRenderedPageBreak/>
         <w:t>Redis</w:t>
       </w:r>
       <w:r>
@@ -3300,14 +3539,7 @@
         <w:rPr>
           <w:lang w:val="ru-RU"/>
         </w:rPr>
-        <w:t xml:space="preserve">. Генерация материалов: </w:t>
-      </w:r>
-      <w:r>
-        <w:rPr>
-          <w:lang w:val="ru-RU"/>
-        </w:rPr>
-        <w:lastRenderedPageBreak/>
-        <w:t xml:space="preserve">языковая модель через </w:t>
+        <w:t xml:space="preserve">. Генерация материалов: языковая модель через </w:t>
       </w:r>
       <w:r>
         <w:t>OpenAI</w:t>
@@ -3363,7 +3595,7 @@
           <w:lang w:val="ru-RU"/>
         </w:rPr>
       </w:pPr>
-      <w:bookmarkStart w:id="12" w:name="_Toc231647869"/>
+      <w:bookmarkStart w:id="12" w:name="_Toc231727516"/>
       <w:r>
         <w:rPr>
           <w:lang w:val="ru-RU"/>
@@ -3388,9 +3620,11 @@
         </w:rPr>
         <w:t xml:space="preserve">Серверное приложение собирается в одной точке входа: создаётся экземпляр </w:t>
       </w:r>
+      <w:proofErr w:type="spellStart"/>
       <w:r>
         <w:t>FastAPI</w:t>
       </w:r>
+      <w:proofErr w:type="spellEnd"/>
       <w:r>
         <w:rPr>
           <w:lang w:val="ru-RU"/>
@@ -3404,10 +3638,73 @@
         <w:rPr>
           <w:lang w:val="ru-RU"/>
         </w:rPr>
-        <w:t xml:space="preserve">, подключаются роутеры по доменам (аутентификация, пользователи, лекции, каталог, доски, администрирование, воркеры, экспорт). При старте запускаются фоновые корутины: возврат «зависших» задач транскрибации в очередь, удаление просроченных аудиофайлов и очистка журнала расхода квот. </w:t>
-      </w:r>
-      <w:r>
-        <w:t>Соответствующий фрагмент приведён в листинге 1.</w:t>
+        <w:t xml:space="preserve">, подключаются роутеры по доменам (аутентификация, пользователи, лекции, каталог, доски, администрирование, </w:t>
+      </w:r>
+      <w:proofErr w:type="spellStart"/>
+      <w:r>
+        <w:rPr>
+          <w:lang w:val="ru-RU"/>
+        </w:rPr>
+        <w:t>воркеры</w:t>
+      </w:r>
+      <w:proofErr w:type="spellEnd"/>
+      <w:r>
+        <w:rPr>
+          <w:lang w:val="ru-RU"/>
+        </w:rPr>
+        <w:t xml:space="preserve">, экспорт). При старте запускаются фоновые </w:t>
+      </w:r>
+      <w:proofErr w:type="spellStart"/>
+      <w:r>
+        <w:rPr>
+          <w:lang w:val="ru-RU"/>
+        </w:rPr>
+        <w:t>корутины</w:t>
+      </w:r>
+      <w:proofErr w:type="spellEnd"/>
+      <w:r>
+        <w:rPr>
+          <w:lang w:val="ru-RU"/>
+        </w:rPr>
+        <w:t xml:space="preserve">: возврат «зависших» задач </w:t>
+      </w:r>
+      <w:proofErr w:type="spellStart"/>
+      <w:r>
+        <w:rPr>
+          <w:lang w:val="ru-RU"/>
+        </w:rPr>
+        <w:t>транскрибации</w:t>
+      </w:r>
+      <w:proofErr w:type="spellEnd"/>
+      <w:r>
+        <w:rPr>
+          <w:lang w:val="ru-RU"/>
+        </w:rPr>
+        <w:t xml:space="preserve"> в очередь, удаление просроченных аудиофайлов и очистка журнала расхода квот. </w:t>
+      </w:r>
+      <w:proofErr w:type="spellStart"/>
+      <w:r>
+        <w:t>Соответствующий</w:t>
+      </w:r>
+      <w:proofErr w:type="spellEnd"/>
+      <w:r>
+        <w:t xml:space="preserve"> </w:t>
+      </w:r>
+      <w:proofErr w:type="spellStart"/>
+      <w:r>
+        <w:t>фрагмент</w:t>
+      </w:r>
+      <w:proofErr w:type="spellEnd"/>
+      <w:r>
+        <w:t xml:space="preserve"> </w:t>
+      </w:r>
+      <w:proofErr w:type="spellStart"/>
+      <w:r>
+        <w:t>приведён</w:t>
+      </w:r>
+      <w:proofErr w:type="spellEnd"/>
+      <w:r>
+        <w:t xml:space="preserve"> в листинге 1.</w:t>
       </w:r>
     </w:p>
     <w:tbl>
@@ -3858,12 +4155,14 @@
         </w:rPr>
         <w:t xml:space="preserve">Листинг 1. – Сборка приложения </w:t>
       </w:r>
+      <w:proofErr w:type="spellStart"/>
       <w:r>
         <w:rPr>
           <w:sz w:val="24"/>
         </w:rPr>
         <w:t>FastAPI</w:t>
       </w:r>
+      <w:proofErr w:type="spellEnd"/>
       <w:r>
         <w:rPr>
           <w:sz w:val="24"/>
@@ -3880,11 +4179,12 @@
           <w:lang w:val="ru-RU"/>
         </w:rPr>
       </w:pPr>
-      <w:bookmarkStart w:id="13" w:name="_Toc231647870"/>
-      <w:r>
-        <w:rPr>
-          <w:lang w:val="ru-RU"/>
-        </w:rPr>
+      <w:bookmarkStart w:id="13" w:name="_Toc231727517"/>
+      <w:r>
+        <w:rPr>
+          <w:lang w:val="ru-RU"/>
+        </w:rPr>
+        <w:lastRenderedPageBreak/>
         <w:t>3.4. Модель данных</w:t>
       </w:r>
       <w:bookmarkEnd w:id="13"/>
@@ -3905,9 +4205,11 @@
         </w:rPr>
         <w:t xml:space="preserve">-моделями </w:t>
       </w:r>
+      <w:proofErr w:type="spellStart"/>
       <w:r>
         <w:t>SQLAlchemy</w:t>
       </w:r>
+      <w:proofErr w:type="spellEnd"/>
       <w:r>
         <w:rPr>
           <w:lang w:val="ru-RU"/>
@@ -3939,17 +4241,31 @@
         <w:rPr>
           <w:lang w:val="ru-RU"/>
         </w:rPr>
-        <w:t xml:space="preserve">) и </w:t>
-      </w:r>
-      <w:r>
-        <w:rPr>
-          <w:lang w:val="ru-RU"/>
-        </w:rPr>
-        <w:lastRenderedPageBreak/>
-        <w:t xml:space="preserve">временные метки создания и изменения. Центральная сущность предметной области — лекция, вокруг которой группируются аудиофайлы, транскрипции и сгенерированные материалы. </w:t>
-      </w:r>
-      <w:r>
-        <w:t>Пример модели приведён в листинге 2.</w:t>
+        <w:t xml:space="preserve">) и временные метки создания и изменения. Центральная сущность предметной области — лекция, вокруг которой группируются аудиофайлы, транскрипции и сгенерированные материалы. </w:t>
+      </w:r>
+      <w:proofErr w:type="spellStart"/>
+      <w:r>
+        <w:t>Пример</w:t>
+      </w:r>
+      <w:proofErr w:type="spellEnd"/>
+      <w:r>
+        <w:t xml:space="preserve"> </w:t>
+      </w:r>
+      <w:proofErr w:type="spellStart"/>
+      <w:r>
+        <w:t>модели</w:t>
+      </w:r>
+      <w:proofErr w:type="spellEnd"/>
+      <w:r>
+        <w:t xml:space="preserve"> </w:t>
+      </w:r>
+      <w:proofErr w:type="spellStart"/>
+      <w:r>
+        <w:t>приведён</w:t>
+      </w:r>
+      <w:proofErr w:type="spellEnd"/>
+      <w:r>
+        <w:t xml:space="preserve"> в листинге 2.</w:t>
       </w:r>
     </w:p>
     <w:tbl>
@@ -4259,12 +4575,14 @@
         </w:rPr>
         <w:t xml:space="preserve">-модель лекции (фрагмент </w:t>
       </w:r>
+      <w:proofErr w:type="spellStart"/>
       <w:r>
         <w:rPr>
           <w:sz w:val="24"/>
         </w:rPr>
         <w:t>api</w:t>
       </w:r>
+      <w:proofErr w:type="spellEnd"/>
       <w:r>
         <w:rPr>
           <w:sz w:val="24"/>
@@ -4285,12 +4603,14 @@
         </w:rPr>
         <w:t>.</w:t>
       </w:r>
+      <w:proofErr w:type="spellStart"/>
       <w:r>
         <w:rPr>
           <w:sz w:val="24"/>
         </w:rPr>
         <w:t>py</w:t>
       </w:r>
+      <w:proofErr w:type="spellEnd"/>
       <w:r>
         <w:rPr>
           <w:sz w:val="24"/>
@@ -4307,7 +4627,7 @@
           <w:lang w:val="ru-RU"/>
         </w:rPr>
       </w:pPr>
-      <w:bookmarkStart w:id="14" w:name="_Toc231647871"/>
+      <w:bookmarkStart w:id="14" w:name="_Toc231727518"/>
       <w:r>
         <w:rPr>
           <w:lang w:val="ru-RU"/>
@@ -4344,7 +4664,21 @@
         <w:rPr>
           <w:lang w:val="ru-RU"/>
         </w:rPr>
-        <w:t xml:space="preserve">Взаимодействие клиента и воркеров с сервером построено на </w:t>
+        <w:t xml:space="preserve">Взаимодействие клиента и </w:t>
+      </w:r>
+      <w:proofErr w:type="spellStart"/>
+      <w:r>
+        <w:rPr>
+          <w:lang w:val="ru-RU"/>
+        </w:rPr>
+        <w:t>воркеров</w:t>
+      </w:r>
+      <w:proofErr w:type="spellEnd"/>
+      <w:r>
+        <w:rPr>
+          <w:lang w:val="ru-RU"/>
+        </w:rPr>
+        <w:t xml:space="preserve"> с сервером построено на </w:t>
       </w:r>
       <w:r>
         <w:t>REST</w:t>
@@ -4353,7 +4687,49 @@
         <w:rPr>
           <w:lang w:val="ru-RU"/>
         </w:rPr>
-        <w:t xml:space="preserve">-эндпоинтах. Воркеры аутентифицируются отдельным ключом и забирают задачи из очереди. Чтобы два воркера не взяли одну и ту же задачу, выдача реализована через блокировку строки </w:t>
+        <w:t>-</w:t>
+      </w:r>
+      <w:proofErr w:type="spellStart"/>
+      <w:r>
+        <w:rPr>
+          <w:lang w:val="ru-RU"/>
+        </w:rPr>
+        <w:t>эндпоинтах</w:t>
+      </w:r>
+      <w:proofErr w:type="spellEnd"/>
+      <w:r>
+        <w:rPr>
+          <w:lang w:val="ru-RU"/>
+        </w:rPr>
+        <w:t xml:space="preserve">. </w:t>
+      </w:r>
+      <w:proofErr w:type="spellStart"/>
+      <w:r>
+        <w:rPr>
+          <w:lang w:val="ru-RU"/>
+        </w:rPr>
+        <w:t>Воркеры</w:t>
+      </w:r>
+      <w:proofErr w:type="spellEnd"/>
+      <w:r>
+        <w:rPr>
+          <w:lang w:val="ru-RU"/>
+        </w:rPr>
+        <w:t xml:space="preserve"> аутентифицируются отдельным ключом и забирают задачи из очереди. Чтобы два </w:t>
+      </w:r>
+      <w:proofErr w:type="spellStart"/>
+      <w:r>
+        <w:rPr>
+          <w:lang w:val="ru-RU"/>
+        </w:rPr>
+        <w:t>воркера</w:t>
+      </w:r>
+      <w:proofErr w:type="spellEnd"/>
+      <w:r>
+        <w:rPr>
+          <w:lang w:val="ru-RU"/>
+        </w:rPr>
+        <w:t xml:space="preserve"> не взяли одну и ту же задачу, выдача реализована через блокировку строки </w:t>
       </w:r>
       <w:r>
         <w:t>SELECT</w:t>
@@ -4435,7 +4811,55 @@
                 <w:rFonts w:ascii="Consolas" w:eastAsia="Consolas" w:hAnsi="Consolas"/>
                 <w:sz w:val="18"/>
               </w:rPr>
-              <w:t>@router.get("/next", response_model=WorkerNextTaskOut)</w:t>
+              <w:t>@</w:t>
+            </w:r>
+            <w:proofErr w:type="gramStart"/>
+            <w:r>
+              <w:rPr>
+                <w:rFonts w:ascii="Consolas" w:eastAsia="Consolas" w:hAnsi="Consolas"/>
+                <w:sz w:val="18"/>
+              </w:rPr>
+              <w:t>router.get(</w:t>
+            </w:r>
+            <w:proofErr w:type="gramEnd"/>
+            <w:r>
+              <w:rPr>
+                <w:rFonts w:ascii="Consolas" w:eastAsia="Consolas" w:hAnsi="Consolas"/>
+                <w:sz w:val="18"/>
+              </w:rPr>
+              <w:t xml:space="preserve">"/next", </w:t>
+            </w:r>
+            <w:proofErr w:type="spellStart"/>
+            <w:r>
+              <w:rPr>
+                <w:rFonts w:ascii="Consolas" w:eastAsia="Consolas" w:hAnsi="Consolas"/>
+                <w:sz w:val="18"/>
+              </w:rPr>
+              <w:t>response_model</w:t>
+            </w:r>
+            <w:proofErr w:type="spellEnd"/>
+            <w:r>
+              <w:rPr>
+                <w:rFonts w:ascii="Consolas" w:eastAsia="Consolas" w:hAnsi="Consolas"/>
+                <w:sz w:val="18"/>
+              </w:rPr>
+              <w:t>=</w:t>
+            </w:r>
+            <w:proofErr w:type="spellStart"/>
+            <w:r>
+              <w:rPr>
+                <w:rFonts w:ascii="Consolas" w:eastAsia="Consolas" w:hAnsi="Consolas"/>
+                <w:sz w:val="18"/>
+              </w:rPr>
+              <w:t>WorkerNextTaskOut</w:t>
+            </w:r>
+            <w:proofErr w:type="spellEnd"/>
+            <w:r>
+              <w:rPr>
+                <w:rFonts w:ascii="Consolas" w:eastAsia="Consolas" w:hAnsi="Consolas"/>
+                <w:sz w:val="18"/>
+              </w:rPr>
+              <w:t>)</w:t>
             </w:r>
           </w:p>
           <w:p>
@@ -4606,7 +5030,25 @@
                 <w:sz w:val="18"/>
                 <w:lang w:val="ru-RU"/>
               </w:rPr>
-              <w:t xml:space="preserve"> — два воркера не возьмут одну задачу."""</w:t>
+              <w:t xml:space="preserve"> — два </w:t>
+            </w:r>
+            <w:proofErr w:type="spellStart"/>
+            <w:r>
+              <w:rPr>
+                <w:rFonts w:ascii="Consolas" w:eastAsia="Consolas" w:hAnsi="Consolas"/>
+                <w:sz w:val="18"/>
+                <w:lang w:val="ru-RU"/>
+              </w:rPr>
+              <w:t>воркера</w:t>
+            </w:r>
+            <w:proofErr w:type="spellEnd"/>
+            <w:r>
+              <w:rPr>
+                <w:rFonts w:ascii="Consolas" w:eastAsia="Consolas" w:hAnsi="Consolas"/>
+                <w:sz w:val="18"/>
+                <w:lang w:val="ru-RU"/>
+              </w:rPr>
+              <w:t xml:space="preserve"> не возьмут одну задачу."""</w:t>
             </w:r>
           </w:p>
           <w:p>
@@ -4628,7 +5070,25 @@
                 <w:rFonts w:ascii="Consolas" w:eastAsia="Consolas" w:hAnsi="Consolas"/>
                 <w:sz w:val="18"/>
               </w:rPr>
-              <w:t>async with db.begin():</w:t>
+              <w:t xml:space="preserve">async with </w:t>
+            </w:r>
+            <w:proofErr w:type="spellStart"/>
+            <w:proofErr w:type="gramStart"/>
+            <w:r>
+              <w:rPr>
+                <w:rFonts w:ascii="Consolas" w:eastAsia="Consolas" w:hAnsi="Consolas"/>
+                <w:sz w:val="18"/>
+              </w:rPr>
+              <w:t>db.begin</w:t>
+            </w:r>
+            <w:proofErr w:type="spellEnd"/>
+            <w:proofErr w:type="gramEnd"/>
+            <w:r>
+              <w:rPr>
+                <w:rFonts w:ascii="Consolas" w:eastAsia="Consolas" w:hAnsi="Consolas"/>
+                <w:sz w:val="18"/>
+              </w:rPr>
+              <w:t>():</w:t>
             </w:r>
           </w:p>
           <w:p>
@@ -4754,6 +5214,7 @@
                 <w:rFonts w:ascii="Consolas" w:eastAsia="Consolas" w:hAnsi="Consolas"/>
                 <w:sz w:val="18"/>
               </w:rPr>
+              <w:lastRenderedPageBreak/>
               <w:t xml:space="preserve">        if task is None:</w:t>
             </w:r>
           </w:p>
@@ -4845,7 +5306,6 @@
                 <w:rFonts w:ascii="Consolas" w:eastAsia="Consolas" w:hAnsi="Consolas"/>
                 <w:sz w:val="18"/>
               </w:rPr>
-              <w:lastRenderedPageBreak/>
               <w:t xml:space="preserve">        task.last_heartbeat_at = now</w:t>
             </w:r>
           </w:p>
@@ -4901,14 +5361,33 @@
           <w:sz w:val="24"/>
           <w:lang w:val="ru-RU"/>
         </w:rPr>
-        <w:t>Листинг 3. – Выдача задачи воркеру из очереди (</w:t>
-      </w:r>
+        <w:lastRenderedPageBreak/>
+        <w:t xml:space="preserve">Листинг 3. – Выдача задачи </w:t>
+      </w:r>
+      <w:proofErr w:type="spellStart"/>
       <w:r>
         <w:rPr>
           <w:sz w:val="24"/>
+          <w:lang w:val="ru-RU"/>
+        </w:rPr>
+        <w:t>воркеру</w:t>
+      </w:r>
+      <w:proofErr w:type="spellEnd"/>
+      <w:r>
+        <w:rPr>
+          <w:sz w:val="24"/>
+          <w:lang w:val="ru-RU"/>
+        </w:rPr>
+        <w:t xml:space="preserve"> из очереди (</w:t>
+      </w:r>
+      <w:proofErr w:type="spellStart"/>
+      <w:r>
+        <w:rPr>
+          <w:sz w:val="24"/>
         </w:rPr>
         <w:t>api</w:t>
       </w:r>
+      <w:proofErr w:type="spellEnd"/>
       <w:r>
         <w:rPr>
           <w:sz w:val="24"/>
@@ -4942,12 +5421,14 @@
         </w:rPr>
         <w:t>.</w:t>
       </w:r>
+      <w:proofErr w:type="spellStart"/>
       <w:r>
         <w:rPr>
           <w:sz w:val="24"/>
         </w:rPr>
         <w:t>py</w:t>
       </w:r>
+      <w:proofErr w:type="spellEnd"/>
       <w:r>
         <w:rPr>
           <w:sz w:val="24"/>
@@ -4964,12 +5445,26 @@
           <w:lang w:val="ru-RU"/>
         </w:rPr>
       </w:pPr>
-      <w:bookmarkStart w:id="15" w:name="_Toc231647872"/>
-      <w:r>
-        <w:rPr>
-          <w:lang w:val="ru-RU"/>
-        </w:rPr>
-        <w:t>3.6. Распознавание речи (воркер)</w:t>
+      <w:bookmarkStart w:id="15" w:name="_Toc231727519"/>
+      <w:r>
+        <w:rPr>
+          <w:lang w:val="ru-RU"/>
+        </w:rPr>
+        <w:t>3.6. Распознавание речи (</w:t>
+      </w:r>
+      <w:proofErr w:type="spellStart"/>
+      <w:r>
+        <w:rPr>
+          <w:lang w:val="ru-RU"/>
+        </w:rPr>
+        <w:t>воркер</w:t>
+      </w:r>
+      <w:proofErr w:type="spellEnd"/>
+      <w:r>
+        <w:rPr>
+          <w:lang w:val="ru-RU"/>
+        </w:rPr>
+        <w:t>)</w:t>
       </w:r>
       <w:bookmarkEnd w:id="15"/>
     </w:p>
@@ -4979,11 +5474,19 @@
           <w:lang w:val="ru-RU"/>
         </w:rPr>
       </w:pPr>
-      <w:r>
-        <w:rPr>
-          <w:lang w:val="ru-RU"/>
-        </w:rPr>
-        <w:t xml:space="preserve">Воркер — это отдельный настольный процесс, запускаемый на машине с </w:t>
+      <w:proofErr w:type="spellStart"/>
+      <w:r>
+        <w:rPr>
+          <w:lang w:val="ru-RU"/>
+        </w:rPr>
+        <w:t>Воркер</w:t>
+      </w:r>
+      <w:proofErr w:type="spellEnd"/>
+      <w:r>
+        <w:rPr>
+          <w:lang w:val="ru-RU"/>
+        </w:rPr>
+        <w:t xml:space="preserve"> — это отдельный настольный процесс, запускаемый на машине с </w:t>
       </w:r>
       <w:r>
         <w:t>GPU</w:t>
@@ -5270,12 +5773,46 @@
               </w:rPr>
               <w:t xml:space="preserve">            </w:t>
             </w:r>
+            <w:proofErr w:type="gramStart"/>
             <w:r>
               <w:rPr>
                 <w:rFonts w:ascii="Consolas" w:eastAsia="Consolas" w:hAnsi="Consolas"/>
                 <w:sz w:val="18"/>
               </w:rPr>
-              <w:t>self._reset_session()</w:t>
+              <w:t>self._</w:t>
+            </w:r>
+            <w:proofErr w:type="spellStart"/>
+            <w:proofErr w:type="gramEnd"/>
+            <w:r>
+              <w:rPr>
+                <w:rFonts w:ascii="Consolas" w:eastAsia="Consolas" w:hAnsi="Consolas"/>
+                <w:sz w:val="18"/>
+              </w:rPr>
+              <w:t>reset_</w:t>
+            </w:r>
+            <w:proofErr w:type="gramStart"/>
+            <w:r>
+              <w:rPr>
+                <w:rFonts w:ascii="Consolas" w:eastAsia="Consolas" w:hAnsi="Consolas"/>
+                <w:sz w:val="18"/>
+              </w:rPr>
+              <w:t>session</w:t>
+            </w:r>
+            <w:proofErr w:type="spellEnd"/>
+            <w:r>
+              <w:rPr>
+                <w:rFonts w:ascii="Consolas" w:eastAsia="Consolas" w:hAnsi="Consolas"/>
+                <w:sz w:val="18"/>
+              </w:rPr>
+              <w:t>(</w:t>
+            </w:r>
+            <w:proofErr w:type="gramEnd"/>
+            <w:r>
+              <w:rPr>
+                <w:rFonts w:ascii="Consolas" w:eastAsia="Consolas" w:hAnsi="Consolas"/>
+                <w:sz w:val="18"/>
+              </w:rPr>
+              <w:t>)</w:t>
             </w:r>
           </w:p>
           <w:p>
@@ -5379,11 +5916,43 @@
           <w:sz w:val="24"/>
           <w:lang w:val="ru-RU"/>
         </w:rPr>
-        <w:t>Листинг 4. – Главный цикл воркера транскрибации (</w:t>
-      </w:r>
+        <w:t xml:space="preserve">Листинг 4. – Главный цикл </w:t>
+      </w:r>
+      <w:proofErr w:type="spellStart"/>
       <w:r>
         <w:rPr>
           <w:sz w:val="24"/>
+          <w:lang w:val="ru-RU"/>
+        </w:rPr>
+        <w:t>воркера</w:t>
+      </w:r>
+      <w:proofErr w:type="spellEnd"/>
+      <w:r>
+        <w:rPr>
+          <w:sz w:val="24"/>
+          <w:lang w:val="ru-RU"/>
+        </w:rPr>
+        <w:t xml:space="preserve"> </w:t>
+      </w:r>
+      <w:proofErr w:type="spellStart"/>
+      <w:r>
+        <w:rPr>
+          <w:sz w:val="24"/>
+          <w:lang w:val="ru-RU"/>
+        </w:rPr>
+        <w:t>транскрибации</w:t>
+      </w:r>
+      <w:proofErr w:type="spellEnd"/>
+      <w:r>
+        <w:rPr>
+          <w:sz w:val="24"/>
+          <w:lang w:val="ru-RU"/>
+        </w:rPr>
+        <w:t xml:space="preserve"> (</w:t>
+      </w:r>
+      <w:r>
+        <w:rPr>
+          <w:sz w:val="24"/>
         </w:rPr>
         <w:t>worker</w:t>
       </w:r>
@@ -5407,12 +5976,14 @@
         </w:rPr>
         <w:t>.</w:t>
       </w:r>
+      <w:proofErr w:type="spellStart"/>
       <w:r>
         <w:rPr>
           <w:sz w:val="24"/>
         </w:rPr>
         <w:t>py</w:t>
       </w:r>
+      <w:proofErr w:type="spellEnd"/>
       <w:r>
         <w:rPr>
           <w:sz w:val="24"/>
@@ -5429,7 +6000,7 @@
           <w:lang w:val="ru-RU"/>
         </w:rPr>
       </w:pPr>
-      <w:bookmarkStart w:id="16" w:name="_Toc231647873"/>
+      <w:bookmarkStart w:id="16" w:name="_Toc231727520"/>
       <w:r>
         <w:rPr>
           <w:lang w:val="ru-RU"/>
@@ -5452,10 +6023,46 @@
         <w:rPr>
           <w:lang w:val="ru-RU"/>
         </w:rPr>
-        <w:t xml:space="preserve">За генерацию материалов отвечает отдельный класс-обработчик. В зависимости от выбранного режима и объёма текста он использует либо простую генерацию, либо многошаговую (с разбиением текста на смысловые части и последующим объединением). На выходе нормализуются математические формулы для корректного отображения. </w:t>
-      </w:r>
-      <w:r>
-        <w:t>Логика выбора стратегии показана в листинге 5.</w:t>
+        <w:t xml:space="preserve">За генерацию материалов отвечает отдельный класс-обработчик. В зависимости от выбранного режима и объёма текста он использует либо простую генерацию, либо многошаговую (с разбиением текста на смысловые </w:t>
+      </w:r>
+      <w:r>
+        <w:rPr>
+          <w:lang w:val="ru-RU"/>
+        </w:rPr>
+        <w:lastRenderedPageBreak/>
+        <w:t xml:space="preserve">части и последующим объединением). На выходе нормализуются математические формулы для корректного отображения. </w:t>
+      </w:r>
+      <w:proofErr w:type="spellStart"/>
+      <w:r>
+        <w:t>Логика</w:t>
+      </w:r>
+      <w:proofErr w:type="spellEnd"/>
+      <w:r>
+        <w:t xml:space="preserve"> </w:t>
+      </w:r>
+      <w:proofErr w:type="spellStart"/>
+      <w:r>
+        <w:t>выбора</w:t>
+      </w:r>
+      <w:proofErr w:type="spellEnd"/>
+      <w:r>
+        <w:t xml:space="preserve"> </w:t>
+      </w:r>
+      <w:proofErr w:type="spellStart"/>
+      <w:r>
+        <w:t>стратегии</w:t>
+      </w:r>
+      <w:proofErr w:type="spellEnd"/>
+      <w:r>
+        <w:t xml:space="preserve"> </w:t>
+      </w:r>
+      <w:proofErr w:type="spellStart"/>
+      <w:r>
+        <w:t>показана</w:t>
+      </w:r>
+      <w:proofErr w:type="spellEnd"/>
+      <w:r>
+        <w:t xml:space="preserve"> в листинге 5.</w:t>
       </w:r>
     </w:p>
     <w:tbl>
@@ -5509,7 +6116,6 @@
                 <w:rFonts w:ascii="Consolas" w:eastAsia="Consolas" w:hAnsi="Consolas"/>
                 <w:sz w:val="18"/>
               </w:rPr>
-              <w:lastRenderedPageBreak/>
               <w:t xml:space="preserve">    </w:t>
             </w:r>
             <w:r>
@@ -5588,7 +6194,25 @@
                 <w:rFonts w:ascii="Consolas" w:eastAsia="Consolas" w:hAnsi="Consolas"/>
                 <w:sz w:val="18"/>
               </w:rPr>
-              <w:t>if not text.strip():</w:t>
+              <w:t xml:space="preserve">if not </w:t>
+            </w:r>
+            <w:proofErr w:type="spellStart"/>
+            <w:proofErr w:type="gramStart"/>
+            <w:r>
+              <w:rPr>
+                <w:rFonts w:ascii="Consolas" w:eastAsia="Consolas" w:hAnsi="Consolas"/>
+                <w:sz w:val="18"/>
+              </w:rPr>
+              <w:t>text.strip</w:t>
+            </w:r>
+            <w:proofErr w:type="spellEnd"/>
+            <w:proofErr w:type="gramEnd"/>
+            <w:r>
+              <w:rPr>
+                <w:rFonts w:ascii="Consolas" w:eastAsia="Consolas" w:hAnsi="Consolas"/>
+                <w:sz w:val="18"/>
+              </w:rPr>
+              <w:t>():</w:t>
             </w:r>
           </w:p>
           <w:p>
@@ -5819,12 +6443,14 @@
         </w:rPr>
         <w:t>/</w:t>
       </w:r>
+      <w:proofErr w:type="spellStart"/>
       <w:r>
         <w:rPr>
           <w:sz w:val="24"/>
         </w:rPr>
         <w:t>deepseek</w:t>
       </w:r>
+      <w:proofErr w:type="spellEnd"/>
       <w:r>
         <w:rPr>
           <w:sz w:val="24"/>
@@ -5845,12 +6471,14 @@
         </w:rPr>
         <w:t>.</w:t>
       </w:r>
+      <w:proofErr w:type="spellStart"/>
       <w:r>
         <w:rPr>
           <w:sz w:val="24"/>
         </w:rPr>
         <w:t>py</w:t>
       </w:r>
+      <w:proofErr w:type="spellEnd"/>
       <w:r>
         <w:rPr>
           <w:sz w:val="24"/>
@@ -5867,7 +6495,7 @@
           <w:lang w:val="ru-RU"/>
         </w:rPr>
       </w:pPr>
-      <w:bookmarkStart w:id="17" w:name="_Toc231647874"/>
+      <w:bookmarkStart w:id="17" w:name="_Toc231727521"/>
       <w:r>
         <w:rPr>
           <w:lang w:val="ru-RU"/>
@@ -5915,9 +6543,11 @@
         </w:rPr>
         <w:t>.</w:t>
       </w:r>
+      <w:proofErr w:type="spellStart"/>
       <w:r>
         <w:t>js</w:t>
       </w:r>
+      <w:proofErr w:type="spellEnd"/>
       <w:r>
         <w:rPr>
           <w:lang w:val="ru-RU"/>
@@ -5951,9 +6581,11 @@
         </w:rPr>
         <w:t xml:space="preserve"> в браузерном движке (с поддержкой формул </w:t>
       </w:r>
+      <w:proofErr w:type="spellStart"/>
       <w:r>
         <w:t>KaTeX</w:t>
       </w:r>
+      <w:proofErr w:type="spellEnd"/>
       <w:r>
         <w:rPr>
           <w:lang w:val="ru-RU"/>
@@ -5969,9 +6601,11 @@
         </w:rPr>
         <w:t xml:space="preserve"> — через конвертер </w:t>
       </w:r>
+      <w:proofErr w:type="spellStart"/>
       <w:r>
         <w:t>Pandoc</w:t>
       </w:r>
+      <w:proofErr w:type="spellEnd"/>
       <w:r>
         <w:rPr>
           <w:lang w:val="ru-RU"/>
@@ -5996,7 +6630,7 @@
           <w:lang w:val="ru-RU"/>
         </w:rPr>
       </w:pPr>
-      <w:bookmarkStart w:id="18" w:name="_Toc231647875"/>
+      <w:bookmarkStart w:id="18" w:name="_Toc231727522"/>
       <w:r>
         <w:rPr>
           <w:lang w:val="ru-RU"/>
@@ -6069,7 +6703,21 @@
         <w:rPr>
           <w:lang w:val="ru-RU"/>
         </w:rPr>
-        <w:t xml:space="preserve">. Воркеры распознавания речи запускаются отдельно на рабочих станциях с </w:t>
+        <w:t xml:space="preserve">. </w:t>
+      </w:r>
+      <w:proofErr w:type="spellStart"/>
+      <w:r>
+        <w:rPr>
+          <w:lang w:val="ru-RU"/>
+        </w:rPr>
+        <w:t>Воркеры</w:t>
+      </w:r>
+      <w:proofErr w:type="spellEnd"/>
+      <w:r>
+        <w:rPr>
+          <w:lang w:val="ru-RU"/>
+        </w:rPr>
+        <w:t xml:space="preserve"> распознавания речи запускаются отдельно на рабочих станциях с </w:t>
       </w:r>
       <w:r>
         <w:t>GPU</w:t>
@@ -6078,7 +6726,21 @@
         <w:rPr>
           <w:lang w:val="ru-RU"/>
         </w:rPr>
-        <w:t xml:space="preserve">. Схема базы данных версионируется миграциями </w:t>
+        <w:t xml:space="preserve">. Схема базы данных </w:t>
+      </w:r>
+      <w:proofErr w:type="spellStart"/>
+      <w:r>
+        <w:rPr>
+          <w:lang w:val="ru-RU"/>
+        </w:rPr>
+        <w:t>версионируется</w:t>
+      </w:r>
+      <w:proofErr w:type="spellEnd"/>
+      <w:r>
+        <w:rPr>
+          <w:lang w:val="ru-RU"/>
+        </w:rPr>
+        <w:t xml:space="preserve"> миграциями </w:t>
       </w:r>
       <w:r>
         <w:t>Alembic</w:t>
@@ -6098,7 +6760,7 @@
           <w:lang w:val="ru-RU"/>
         </w:rPr>
       </w:pPr>
-      <w:bookmarkStart w:id="19" w:name="_Toc231647876"/>
+      <w:bookmarkStart w:id="19" w:name="_Toc231727523"/>
       <w:r>
         <w:rPr>
           <w:lang w:val="ru-RU"/>
@@ -6119,14 +6781,37 @@
         </w:rPr>
         <w:t xml:space="preserve">В ходе работы над проектом была разработана веб-платформа </w:t>
       </w:r>
+      <w:proofErr w:type="spellStart"/>
       <w:r>
         <w:t>MindeSync</w:t>
       </w:r>
-      <w:r>
-        <w:rPr>
-          <w:lang w:val="ru-RU"/>
-        </w:rPr>
-        <w:t xml:space="preserve"> для автоматизированной обработки студенческих лекций. Реализован полный конвейер: загрузка записи, постановка задачи в очередь, распознавание речи на отдельных воркер-машинах, очистка текста и генерация учебных материалов языковой моделью, а также их экспорт.</w:t>
+      <w:proofErr w:type="spellEnd"/>
+      <w:r>
+        <w:rPr>
+          <w:lang w:val="ru-RU"/>
+        </w:rPr>
+        <w:t xml:space="preserve"> для автоматизированной обработки студенческих лекций. </w:t>
+      </w:r>
+      <w:r>
+        <w:rPr>
+          <w:lang w:val="ru-RU"/>
+        </w:rPr>
+        <w:lastRenderedPageBreak/>
+        <w:t xml:space="preserve">Реализован полный конвейер: загрузка записи, постановка задачи в очередь, распознавание речи на отдельных </w:t>
+      </w:r>
+      <w:proofErr w:type="spellStart"/>
+      <w:r>
+        <w:rPr>
+          <w:lang w:val="ru-RU"/>
+        </w:rPr>
+        <w:t>воркер</w:t>
+      </w:r>
+      <w:proofErr w:type="spellEnd"/>
+      <w:r>
+        <w:rPr>
+          <w:lang w:val="ru-RU"/>
+        </w:rPr>
+        <w:t>-машинах, очистка текста и генерация учебных материалов языковой моделью, а также их экспорт.</w:t>
       </w:r>
     </w:p>
     <w:p>
@@ -6139,7 +6824,6 @@
         <w:rPr>
           <w:lang w:val="ru-RU"/>
         </w:rPr>
-        <w:lastRenderedPageBreak/>
         <w:t>Спроектирована модульная архитектура, в которой ресурсоёмкие операции (распознавание речи и генерация документов) вынесены в отдельные сервисы, что упрощает масштабирование и сопровождение. Реализованы разграничение прав по ролям, каталог дисциплин с модерацией и совместные доски.</w:t>
       </w:r>
     </w:p>
@@ -6459,31 +7143,31 @@
       </w:rPr>
     </w:lvl>
   </w:abstractNum>
-  <w:num w:numId="1" w16cid:durableId="1926184903">
+  <w:num w:numId="1" w16cid:durableId="1611661996">
     <w:abstractNumId w:val="8"/>
   </w:num>
-  <w:num w:numId="2" w16cid:durableId="2091609780">
+  <w:num w:numId="2" w16cid:durableId="1404529506">
     <w:abstractNumId w:val="6"/>
   </w:num>
-  <w:num w:numId="3" w16cid:durableId="161746051">
+  <w:num w:numId="3" w16cid:durableId="2062820086">
     <w:abstractNumId w:val="5"/>
   </w:num>
-  <w:num w:numId="4" w16cid:durableId="104815612">
+  <w:num w:numId="4" w16cid:durableId="408040808">
     <w:abstractNumId w:val="4"/>
   </w:num>
-  <w:num w:numId="5" w16cid:durableId="2041204386">
+  <w:num w:numId="5" w16cid:durableId="719592478">
     <w:abstractNumId w:val="7"/>
   </w:num>
-  <w:num w:numId="6" w16cid:durableId="1585720110">
+  <w:num w:numId="6" w16cid:durableId="1012298825">
     <w:abstractNumId w:val="3"/>
   </w:num>
-  <w:num w:numId="7" w16cid:durableId="687829133">
+  <w:num w:numId="7" w16cid:durableId="890582089">
     <w:abstractNumId w:val="2"/>
   </w:num>
-  <w:num w:numId="8" w16cid:durableId="2067949218">
+  <w:num w:numId="8" w16cid:durableId="1294411825">
     <w:abstractNumId w:val="1"/>
   </w:num>
-  <w:num w:numId="9" w16cid:durableId="988293441">
+  <w:num w:numId="9" w16cid:durableId="920527647">
     <w:abstractNumId w:val="0"/>
   </w:num>
 </w:numbering>
@@ -17886,7 +18570,7 @@
     <w:autoRedefine/>
     <w:uiPriority w:val="39"/>
     <w:unhideWhenUsed/>
-    <w:rsid w:val="00C0404E"/>
+    <w:rsid w:val="002832D7"/>
     <w:pPr>
       <w:spacing w:after="100"/>
     </w:pPr>
@@ -17898,7 +18582,7 @@
     <w:autoRedefine/>
     <w:uiPriority w:val="39"/>
     <w:unhideWhenUsed/>
-    <w:rsid w:val="00C0404E"/>
+    <w:rsid w:val="002832D7"/>
     <w:pPr>
       <w:spacing w:after="100"/>
       <w:ind w:left="280"/>
@@ -17909,7 +18593,7 @@
     <w:basedOn w:val="a2"/>
     <w:uiPriority w:val="99"/>
     <w:unhideWhenUsed/>
-    <w:rsid w:val="00C0404E"/>
+    <w:rsid w:val="002832D7"/>
     <w:rPr>
       <w:color w:val="0000FF" w:themeColor="hyperlink"/>
       <w:u w:val="single"/>

</xml_diff>